<commit_message>
feat : màj jdt + ajout d'analyse fonctionnelle
</commit_message>
<xml_diff>
--- a/docs/rapport/R-I323-KirilBormin.docx
+++ b/docs/rapport/R-I323-KirilBormin.docx
@@ -2098,32 +2098,79 @@
     </w:p>
     <w:p>
       <w:pPr>
-        <w:pStyle w:val="Informations"/>
-      </w:pPr>
-      <w:r>
-        <w:t xml:space="preserve">A </w:t>
+        <w:pStyle w:val="Retraitcorpsdetexte"/>
+      </w:pPr>
+      <w:r>
+        <w:t>Le projet est une application C# / Windows Forms, qui permet d’afficher et de comparer facilement des courbes de données</w:t>
+      </w:r>
+      <w:r>
+        <w:t xml:space="preserve"> (séries de données dans le temps)</w:t>
+      </w:r>
+      <w:r>
+        <w:t xml:space="preserve">. L’utilisateur peut utiliser 2 sources de données : </w:t>
       </w:r>
       <w:proofErr w:type="spellStart"/>
-      <w:proofErr w:type="gramStart"/>
-      <w:r>
-        <w:t>compléter</w:t>
-      </w:r>
-      <w:r>
-        <w:t>,</w:t>
-      </w:r>
-      <w:r>
-        <w:t>par</w:t>
+      <w:r>
+        <w:t>json</w:t>
       </w:r>
       <w:proofErr w:type="spellEnd"/>
-      <w:proofErr w:type="gramEnd"/>
-      <w:r>
-        <w:t xml:space="preserve"> une explication du contexte, de la situation, des raisons</w:t>
-      </w:r>
-      <w:r>
-        <w:t xml:space="preserve"> générales de la mise en route d’un tel projet. Le lecteur doit pouvoir comprendre les motivations du lancement du projet</w:t>
-      </w:r>
-      <w:r>
-        <w:t xml:space="preserve">… </w:t>
+      <w:r>
+        <w:t xml:space="preserve"> et csv</w:t>
+      </w:r>
+    </w:p>
+    <w:p>
+      <w:pPr>
+        <w:pStyle w:val="Titre2"/>
+      </w:pPr>
+      <w:r>
+        <w:t>Objectifs</w:t>
+      </w:r>
+    </w:p>
+    <w:p>
+      <w:pPr>
+        <w:pStyle w:val="Retraitcorpsdetexte"/>
+      </w:pPr>
+      <w:r>
+        <w:rPr>
+          <w:b/>
+          <w:bCs/>
+        </w:rPr>
+        <w:t>Objectif produit</w:t>
+      </w:r>
+      <w:r>
+        <w:t xml:space="preserve"> : Créer une application simple et rapide pour importer des données, les enregistrer en stockage locale pour travailler hors ligne, et afficher plusieurs courbes en même temps à l’aide de la librairie ScottPlot. </w:t>
+      </w:r>
+    </w:p>
+    <w:p>
+      <w:pPr>
+        <w:pStyle w:val="Retraitcorpsdetexte"/>
+      </w:pPr>
+    </w:p>
+    <w:p>
+      <w:pPr>
+        <w:pStyle w:val="Retraitcorpsdetexte"/>
+      </w:pPr>
+      <w:r>
+        <w:rPr>
+          <w:b/>
+          <w:bCs/>
+        </w:rPr>
+        <w:t>Objectif pédagogique</w:t>
+      </w:r>
+      <w:r>
+        <w:t xml:space="preserve"> : Utiliser les pratiques de la programmation fonctionnelle, apprendre à utiliser </w:t>
+      </w:r>
+      <w:r>
+        <w:t>des</w:t>
+      </w:r>
+      <w:r>
+        <w:t xml:space="preserve"> librairie</w:t>
+      </w:r>
+      <w:r>
+        <w:t>s en C#, améliorer la gestion d’un projet avec un planning précis.</w:t>
+      </w:r>
+      <w:r>
+        <w:t xml:space="preserve">  </w:t>
       </w:r>
     </w:p>
     <w:p>
@@ -2251,13 +2298,8 @@
               <w:ind w:left="0"/>
             </w:pPr>
             <w:r>
-              <w:t xml:space="preserve">Intégration de la librairie </w:t>
+              <w:t>Intégration de la librairie ScottPlot</w:t>
             </w:r>
-            <w:proofErr w:type="spellStart"/>
-            <w:r>
-              <w:t>ScottPlot</w:t>
-            </w:r>
-            <w:proofErr w:type="spellEnd"/>
           </w:p>
         </w:tc>
       </w:tr>
@@ -2289,13 +2331,8 @@
               <w:ind w:left="0"/>
             </w:pPr>
             <w:r>
-              <w:t xml:space="preserve">Intégration de la librairie </w:t>
+              <w:t>Intégration de la librairie ScottPlot</w:t>
             </w:r>
-            <w:proofErr w:type="spellStart"/>
-            <w:r>
-              <w:t>ScottPlot</w:t>
-            </w:r>
-            <w:proofErr w:type="spellEnd"/>
           </w:p>
         </w:tc>
       </w:tr>
@@ -2425,6 +2462,507 @@
       </w:pPr>
       <w:bookmarkStart w:id="8" w:name="_Toc71040027"/>
       <w:r>
+        <w:t>Analyse fonctionnele</w:t>
+      </w:r>
+    </w:p>
+    <w:p>
+      <w:pPr>
+        <w:pStyle w:val="Titre2"/>
+      </w:pPr>
+      <w:r>
+        <w:t>#1 — Ajout d'une nouvelle serie depuis un fichier</w:t>
+      </w:r>
+    </w:p>
+    <w:p>
+      <w:r>
+        <w:t>En tant qu'utilisateur,</w:t>
+      </w:r>
+    </w:p>
+    <w:p>
+      <w:r>
+        <w:t xml:space="preserve">Je veux pouvoir facilement et d'une manière simple ajouter ma </w:t>
+      </w:r>
+      <w:r>
+        <w:t>série</w:t>
+      </w:r>
+      <w:r>
+        <w:t xml:space="preserve"> de données dans le programme.</w:t>
+      </w:r>
+    </w:p>
+    <w:p>
+      <w:r>
+        <w:t>Afin de charger et stocker localement de nouvelles séries temporelles pour une utilisation hors ligne.</w:t>
+      </w:r>
+    </w:p>
+    <w:p/>
+    <w:p>
+      <w:r>
+        <w:t>•   Sur la page principale, dans le menu</w:t>
+      </w:r>
+      <w:r>
+        <w:t xml:space="preserve"> </w:t>
+      </w:r>
+      <w:r>
+        <w:t>"Fichier" je vois l'option appelé "Importer un fichier")</w:t>
+      </w:r>
+    </w:p>
+    <w:p>
+      <w:r>
+        <w:t>•   En cliquant sur ce bouton, il y a une fenêtre d'explorateur de fichiers qui apparaît, avec le filtre sur les fichiers .</w:t>
+      </w:r>
+      <w:proofErr w:type="gramStart"/>
+      <w:r>
+        <w:t>csv .</w:t>
+      </w:r>
+      <w:proofErr w:type="spellStart"/>
+      <w:r>
+        <w:t>json</w:t>
+      </w:r>
+      <w:proofErr w:type="spellEnd"/>
+      <w:proofErr w:type="gramEnd"/>
+    </w:p>
+    <w:p>
+      <w:r>
+        <w:t xml:space="preserve">  -   Après l'ajout d'un fichier, la (les) série(s) est enregistrée dans le stockage local et devient disponible dans la liste des graphiques</w:t>
+      </w:r>
+    </w:p>
+    <w:p>
+      <w:r>
+        <w:t xml:space="preserve">  -   Si après avoir choisi le fichier, qui est corrompu ou introuvable, une fenêtre avec l'erreur s'affiche au centre.</w:t>
+      </w:r>
+    </w:p>
+    <w:p/>
+    <w:p/>
+    <w:p>
+      <w:r>
+        <w:rPr>
+          <w:noProof/>
+        </w:rPr>
+        <w:drawing>
+          <wp:inline distT="0" distB="0" distL="0" distR="0" wp14:anchorId="566B859F" wp14:editId="75F2062A">
+            <wp:extent cx="4762500" cy="2838450"/>
+            <wp:effectExtent l="0" t="0" r="0" b="0"/>
+            <wp:docPr id="1" name="Image 1"/>
+            <wp:cNvGraphicFramePr>
+              <a:graphicFrameLocks xmlns:a="http://schemas.openxmlformats.org/drawingml/2006/main" noChangeAspect="1"/>
+            </wp:cNvGraphicFramePr>
+            <a:graphic xmlns:a="http://schemas.openxmlformats.org/drawingml/2006/main">
+              <a:graphicData uri="http://schemas.openxmlformats.org/drawingml/2006/picture">
+                <pic:pic xmlns:pic="http://schemas.openxmlformats.org/drawingml/2006/picture">
+                  <pic:nvPicPr>
+                    <pic:cNvPr id="0" name=""/>
+                    <pic:cNvPicPr>
+                      <a:picLocks noChangeAspect="1" noChangeArrowheads="1"/>
+                    </pic:cNvPicPr>
+                  </pic:nvPicPr>
+                  <pic:blipFill>
+                    <a:blip r:embed="rId12"/>
+                    <a:srcRect/>
+                    <a:stretch>
+                      <a:fillRect/>
+                    </a:stretch>
+                  </pic:blipFill>
+                  <pic:spPr bwMode="auto">
+                    <a:xfrm>
+                      <a:off x="0" y="0"/>
+                      <a:ext cx="4762500" cy="2838450"/>
+                    </a:xfrm>
+                    <a:prstGeom prst="rect">
+                      <a:avLst/>
+                    </a:prstGeom>
+                  </pic:spPr>
+                </pic:pic>
+              </a:graphicData>
+            </a:graphic>
+          </wp:inline>
+        </w:drawing>
+      </w:r>
+    </w:p>
+    <w:p/>
+    <w:p/>
+    <w:p>
+      <w:pPr>
+        <w:pStyle w:val="Titre2"/>
+      </w:pPr>
+      <w:r>
+        <w:t>#2 — Masquer une série</w:t>
+      </w:r>
+    </w:p>
+    <w:p>
+      <w:r>
+        <w:t>En tant qu'utilisateur,</w:t>
+      </w:r>
+    </w:p>
+    <w:p>
+      <w:r>
+        <w:t xml:space="preserve">Je veux pouvoir masquer une </w:t>
+      </w:r>
+      <w:proofErr w:type="spellStart"/>
+      <w:r>
+        <w:t>serie</w:t>
+      </w:r>
+      <w:proofErr w:type="spellEnd"/>
+      <w:r>
+        <w:t xml:space="preserve"> de la vue active,</w:t>
+      </w:r>
+    </w:p>
+    <w:p>
+      <w:r>
+        <w:t>Afin de pouvoir gérer les graphiques que je veux apercevoir.</w:t>
+      </w:r>
+    </w:p>
+    <w:p/>
+    <w:p>
+      <w:r>
+        <w:t xml:space="preserve">•   Une liste </w:t>
+      </w:r>
+      <w:proofErr w:type="spellStart"/>
+      <w:r>
+        <w:t>cochable</w:t>
+      </w:r>
+      <w:proofErr w:type="spellEnd"/>
+      <w:r>
+        <w:t xml:space="preserve"> de suppression retire une courbe du graphique immédiatement.</w:t>
+      </w:r>
+    </w:p>
+    <w:p/>
+    <w:p/>
+    <w:p>
+      <w:r>
+        <w:rPr>
+          <w:noProof/>
+        </w:rPr>
+        <w:drawing>
+          <wp:inline distT="0" distB="0" distL="0" distR="0" wp14:anchorId="60E37E8E" wp14:editId="127AECD3">
+            <wp:extent cx="4762500" cy="2847975"/>
+            <wp:effectExtent l="0" t="0" r="0" b="0"/>
+            <wp:docPr id="1060780211" name="Image 1060780211"/>
+            <wp:cNvGraphicFramePr>
+              <a:graphicFrameLocks xmlns:a="http://schemas.openxmlformats.org/drawingml/2006/main" noChangeAspect="1"/>
+            </wp:cNvGraphicFramePr>
+            <a:graphic xmlns:a="http://schemas.openxmlformats.org/drawingml/2006/main">
+              <a:graphicData uri="http://schemas.openxmlformats.org/drawingml/2006/picture">
+                <pic:pic xmlns:pic="http://schemas.openxmlformats.org/drawingml/2006/picture">
+                  <pic:nvPicPr>
+                    <pic:cNvPr id="0" name=""/>
+                    <pic:cNvPicPr>
+                      <a:picLocks noChangeAspect="1" noChangeArrowheads="1"/>
+                    </pic:cNvPicPr>
+                  </pic:nvPicPr>
+                  <pic:blipFill>
+                    <a:blip r:embed="rId13"/>
+                    <a:srcRect/>
+                    <a:stretch>
+                      <a:fillRect/>
+                    </a:stretch>
+                  </pic:blipFill>
+                  <pic:spPr bwMode="auto">
+                    <a:xfrm>
+                      <a:off x="0" y="0"/>
+                      <a:ext cx="4762500" cy="2847975"/>
+                    </a:xfrm>
+                    <a:prstGeom prst="rect">
+                      <a:avLst/>
+                    </a:prstGeom>
+                  </pic:spPr>
+                </pic:pic>
+              </a:graphicData>
+            </a:graphic>
+          </wp:inline>
+        </w:drawing>
+      </w:r>
+    </w:p>
+    <w:p/>
+    <w:p/>
+    <w:p>
+      <w:pPr>
+        <w:pStyle w:val="Titre2"/>
+      </w:pPr>
+      <w:r>
+        <w:t>#3 — Interaction avec le graphique</w:t>
+      </w:r>
+    </w:p>
+    <w:p>
+      <w:r>
+        <w:t>En tant qu'utilisateur,</w:t>
+      </w:r>
+    </w:p>
+    <w:p>
+      <w:r>
+        <w:t>Je veux pouvoir interagir avec le graphique, en zoomant et en le déplaçant dans tous les sens.</w:t>
+      </w:r>
+    </w:p>
+    <w:p>
+      <w:r>
+        <w:lastRenderedPageBreak/>
+        <w:t>Afin de pouvoir mieux analyser les données</w:t>
+      </w:r>
+    </w:p>
+    <w:p/>
+    <w:p>
+      <w:r>
+        <w:t>•   Actionner la molette de la souris sur le graphique -&gt; L'échelle temporelle s'ajuste fluidement (zoom avant/arrière) autour du curseur.</w:t>
+      </w:r>
+    </w:p>
+    <w:p>
+      <w:r>
+        <w:t>•   Un clique-glisser défile le long des axes</w:t>
+      </w:r>
+    </w:p>
+    <w:p>
+      <w:r>
+        <w:t>•   Un bouton qui permet de réinitialiser le zoom est présent et fonctionnel</w:t>
+      </w:r>
+    </w:p>
+    <w:p/>
+    <w:p/>
+    <w:p>
+      <w:r>
+        <w:rPr>
+          <w:noProof/>
+        </w:rPr>
+        <w:drawing>
+          <wp:inline distT="0" distB="0" distL="0" distR="0" wp14:anchorId="10DC08F6" wp14:editId="64508295">
+            <wp:extent cx="4762500" cy="1895475"/>
+            <wp:effectExtent l="0" t="0" r="0" b="0"/>
+            <wp:docPr id="2080967850" name="Image 2080967850"/>
+            <wp:cNvGraphicFramePr>
+              <a:graphicFrameLocks xmlns:a="http://schemas.openxmlformats.org/drawingml/2006/main" noChangeAspect="1"/>
+            </wp:cNvGraphicFramePr>
+            <a:graphic xmlns:a="http://schemas.openxmlformats.org/drawingml/2006/main">
+              <a:graphicData uri="http://schemas.openxmlformats.org/drawingml/2006/picture">
+                <pic:pic xmlns:pic="http://schemas.openxmlformats.org/drawingml/2006/picture">
+                  <pic:nvPicPr>
+                    <pic:cNvPr id="0" name=""/>
+                    <pic:cNvPicPr>
+                      <a:picLocks noChangeAspect="1" noChangeArrowheads="1"/>
+                    </pic:cNvPicPr>
+                  </pic:nvPicPr>
+                  <pic:blipFill>
+                    <a:blip r:embed="rId14"/>
+                    <a:srcRect/>
+                    <a:stretch>
+                      <a:fillRect/>
+                    </a:stretch>
+                  </pic:blipFill>
+                  <pic:spPr bwMode="auto">
+                    <a:xfrm>
+                      <a:off x="0" y="0"/>
+                      <a:ext cx="4762500" cy="1895475"/>
+                    </a:xfrm>
+                    <a:prstGeom prst="rect">
+                      <a:avLst/>
+                    </a:prstGeom>
+                  </pic:spPr>
+                </pic:pic>
+              </a:graphicData>
+            </a:graphic>
+          </wp:inline>
+        </w:drawing>
+      </w:r>
+    </w:p>
+    <w:p/>
+    <w:p/>
+    <w:p>
+      <w:pPr>
+        <w:pStyle w:val="Titre2"/>
+      </w:pPr>
+      <w:r>
+        <w:t xml:space="preserve">#4 — Labels </w:t>
+      </w:r>
+      <w:proofErr w:type="gramStart"/>
+      <w:r>
+        <w:t>des graphique</w:t>
+      </w:r>
+      <w:proofErr w:type="gramEnd"/>
+    </w:p>
+    <w:p>
+      <w:r>
+        <w:t>En tant qu'utilisateur,</w:t>
+      </w:r>
+    </w:p>
+    <w:p>
+      <w:r>
+        <w:t>Je veux pouvoir identifier chaque graphique à l'aide de sa couleur et de la légende dans un coin de la fenêtre,</w:t>
+      </w:r>
+    </w:p>
+    <w:p>
+      <w:r>
+        <w:t>Afin de ne pas confondre plusieurs graphiques</w:t>
+      </w:r>
+    </w:p>
+    <w:p/>
+    <w:p>
+      <w:r>
+        <w:t>•   Si plusieurs séries sont affichées en même temps, chaque courbe est tracée avec une couleur propre et contrastée</w:t>
+      </w:r>
+    </w:p>
+    <w:p>
+      <w:r>
+        <w:t>•   Afficher ou masquer une série -</w:t>
+      </w:r>
+      <w:proofErr w:type="gramStart"/>
+      <w:r>
+        <w:t>&gt;  La</w:t>
+      </w:r>
+      <w:proofErr w:type="gramEnd"/>
+      <w:r>
+        <w:t xml:space="preserve"> légende actualise instantanément le nom et la pastille de couleur correspondante.</w:t>
+      </w:r>
+    </w:p>
+    <w:p/>
+    <w:p/>
+    <w:p>
+      <w:r>
+        <w:rPr>
+          <w:noProof/>
+        </w:rPr>
+        <w:drawing>
+          <wp:inline distT="0" distB="0" distL="0" distR="0" wp14:anchorId="7FAE7753" wp14:editId="6324AC41">
+            <wp:extent cx="4762500" cy="2400300"/>
+            <wp:effectExtent l="0" t="0" r="0" b="0"/>
+            <wp:docPr id="968844048" name="Image 968844048"/>
+            <wp:cNvGraphicFramePr>
+              <a:graphicFrameLocks xmlns:a="http://schemas.openxmlformats.org/drawingml/2006/main" noChangeAspect="1"/>
+            </wp:cNvGraphicFramePr>
+            <a:graphic xmlns:a="http://schemas.openxmlformats.org/drawingml/2006/main">
+              <a:graphicData uri="http://schemas.openxmlformats.org/drawingml/2006/picture">
+                <pic:pic xmlns:pic="http://schemas.openxmlformats.org/drawingml/2006/picture">
+                  <pic:nvPicPr>
+                    <pic:cNvPr id="0" name=""/>
+                    <pic:cNvPicPr>
+                      <a:picLocks noChangeAspect="1" noChangeArrowheads="1"/>
+                    </pic:cNvPicPr>
+                  </pic:nvPicPr>
+                  <pic:blipFill>
+                    <a:blip r:embed="rId15"/>
+                    <a:srcRect/>
+                    <a:stretch>
+                      <a:fillRect/>
+                    </a:stretch>
+                  </pic:blipFill>
+                  <pic:spPr bwMode="auto">
+                    <a:xfrm>
+                      <a:off x="0" y="0"/>
+                      <a:ext cx="4762500" cy="2400300"/>
+                    </a:xfrm>
+                    <a:prstGeom prst="rect">
+                      <a:avLst/>
+                    </a:prstGeom>
+                  </pic:spPr>
+                </pic:pic>
+              </a:graphicData>
+            </a:graphic>
+          </wp:inline>
+        </w:drawing>
+      </w:r>
+    </w:p>
+    <w:p/>
+    <w:p/>
+    <w:p>
+      <w:pPr>
+        <w:pStyle w:val="Titre2"/>
+      </w:pPr>
+      <w:r>
+        <w:t>#5 — Ajout de jeu de données depuis une API</w:t>
+      </w:r>
+    </w:p>
+    <w:p>
+      <w:r>
+        <w:t>En tant qu'utilisateur,</w:t>
+      </w:r>
+    </w:p>
+    <w:p>
+      <w:r>
+        <w:lastRenderedPageBreak/>
+        <w:t>Je veux pouvoir récupérer et intégrer un jeu de données directement depuis une API externe.</w:t>
+      </w:r>
+    </w:p>
+    <w:p>
+      <w:r>
+        <w:t>Afin de charger des données distantes à jour et les stocker localement pour une utilisation hors ligne.</w:t>
+      </w:r>
+    </w:p>
+    <w:p/>
+    <w:p>
+      <w:r>
+        <w:t>•   Sur la page principale, dans le menu « Fichier », je vois l'option appelée « Importer depuis une API ».</w:t>
+      </w:r>
+    </w:p>
+    <w:p>
+      <w:r>
+        <w:t>•   En cliquant sur cette option, une fenêtre s'affiche pour saisir l'URL de l'API (point de terminaison) et les paramètres de requête éventuels (ex. clé d'API, dates).</w:t>
+      </w:r>
+    </w:p>
+    <w:p>
+      <w:r>
+        <w:t xml:space="preserve">  -   Après validation et récupération des données, la (les) série(s) est enregistrée dans le stockage local et devient disponible dans la liste des graphiques.</w:t>
+      </w:r>
+    </w:p>
+    <w:p>
+      <w:r>
+        <w:t xml:space="preserve">  -   Si l'URL est invalide, la connexion réseau échoue ou le format des données reçues est corrompu/incompatible, une fenêtre avec un message d'erreur explicite s'affiche au centre.</w:t>
+      </w:r>
+    </w:p>
+    <w:p/>
+    <w:p/>
+    <w:p>
+      <w:r>
+        <w:rPr>
+          <w:noProof/>
+        </w:rPr>
+        <w:drawing>
+          <wp:inline distT="0" distB="0" distL="0" distR="0" wp14:anchorId="10F11242" wp14:editId="0B561CE3">
+            <wp:extent cx="4762500" cy="2905125"/>
+            <wp:effectExtent l="0" t="0" r="0" b="0"/>
+            <wp:docPr id="1338732340" name="Image 1338732340"/>
+            <wp:cNvGraphicFramePr>
+              <a:graphicFrameLocks xmlns:a="http://schemas.openxmlformats.org/drawingml/2006/main" noChangeAspect="1"/>
+            </wp:cNvGraphicFramePr>
+            <a:graphic xmlns:a="http://schemas.openxmlformats.org/drawingml/2006/main">
+              <a:graphicData uri="http://schemas.openxmlformats.org/drawingml/2006/picture">
+                <pic:pic xmlns:pic="http://schemas.openxmlformats.org/drawingml/2006/picture">
+                  <pic:nvPicPr>
+                    <pic:cNvPr id="0" name=""/>
+                    <pic:cNvPicPr>
+                      <a:picLocks noChangeAspect="1" noChangeArrowheads="1"/>
+                    </pic:cNvPicPr>
+                  </pic:nvPicPr>
+                  <pic:blipFill>
+                    <a:blip r:embed="rId16"/>
+                    <a:srcRect/>
+                    <a:stretch>
+                      <a:fillRect/>
+                    </a:stretch>
+                  </pic:blipFill>
+                  <pic:spPr bwMode="auto">
+                    <a:xfrm>
+                      <a:off x="0" y="0"/>
+                      <a:ext cx="4762500" cy="2905125"/>
+                    </a:xfrm>
+                    <a:prstGeom prst="rect">
+                      <a:avLst/>
+                    </a:prstGeom>
+                  </pic:spPr>
+                </pic:pic>
+              </a:graphicData>
+            </a:graphic>
+          </wp:inline>
+        </w:drawing>
+      </w:r>
+    </w:p>
+    <w:p/>
+    <w:p/>
+    <w:p>
+      <w:pPr>
+        <w:pStyle w:val="Corpsdetexte"/>
+      </w:pPr>
+    </w:p>
+    <w:p>
+      <w:pPr>
+        <w:pStyle w:val="Titre1"/>
+      </w:pPr>
+      <w:r>
         <w:t>Points techniques</w:t>
       </w:r>
       <w:bookmarkEnd w:id="8"/>
@@ -2593,6 +3131,7 @@
       </w:pPr>
       <w:bookmarkStart w:id="20" w:name="_Toc71040034"/>
       <w:r>
+        <w:lastRenderedPageBreak/>
         <w:t>Validation client 1</w:t>
       </w:r>
       <w:r>
@@ -2675,7 +3214,6 @@
         </w:numPr>
       </w:pPr>
       <w:r>
-        <w:lastRenderedPageBreak/>
         <w:t>Si ce n’est pas le cas, estimer</w:t>
       </w:r>
       <w:r>
@@ -3077,8 +3615,8 @@
       </w:r>
     </w:p>
     <w:sectPr>
-      <w:headerReference w:type="default" r:id="rId12"/>
-      <w:footerReference w:type="default" r:id="rId13"/>
+      <w:headerReference w:type="default" r:id="rId17"/>
+      <w:footerReference w:type="default" r:id="rId18"/>
       <w:pgSz w:w="11906" w:h="16838" w:code="9"/>
       <w:pgMar w:top="1418" w:right="1418" w:bottom="1418" w:left="1418" w:header="709" w:footer="709" w:gutter="0"/>
       <w:cols w:space="708"/>
@@ -3773,7 +4311,7 @@
         <v:path o:extrusionok="f" gradientshapeok="t" o:connecttype="rect"/>
         <o:lock v:ext="edit" aspectratio="t"/>
       </v:shapetype>
-      <v:shape id="_x0000_i1025" type="#_x0000_t75" style="width:11.3pt;height:11.3pt" o:bullet="t">
+      <v:shape id="_x0000_i1025" type="#_x0000_t75" style="width:11.5pt;height:11.5pt" o:bullet="t">
         <v:imagedata r:id="rId1" o:title="BD10263_"/>
       </v:shape>
     </w:pict>

</xml_diff>

<commit_message>
feat : poser les objectifs et la description du projet
</commit_message>
<xml_diff>
--- a/docs/rapport/R-I323-KirilBormin.docx
+++ b/docs/rapport/R-I323-KirilBormin.docx
@@ -2073,7 +2073,6 @@
           <w:szCs w:val="32"/>
         </w:rPr>
       </w:pPr>
-      <w:proofErr w:type="spellStart"/>
       <w:r>
         <w:rPr>
           <w:rStyle w:val="lev"/>
@@ -2084,7 +2083,6 @@
         </w:rPr>
         <w:t>PlotThoseLines</w:t>
       </w:r>
-      <w:proofErr w:type="spellEnd"/>
     </w:p>
     <w:p>
       <w:pPr>
@@ -2107,16 +2105,198 @@
         <w:t xml:space="preserve"> (séries de données dans le temps)</w:t>
       </w:r>
       <w:r>
-        <w:t xml:space="preserve">. L’utilisateur peut utiliser 2 sources de données : </w:t>
-      </w:r>
-      <w:proofErr w:type="spellStart"/>
-      <w:r>
-        <w:t>json</w:t>
-      </w:r>
-      <w:proofErr w:type="spellEnd"/>
-      <w:r>
-        <w:t xml:space="preserve"> et csv</w:t>
-      </w:r>
+        <w:t>. L’utilisateur peut utiliser 2 sources de données : json et csv</w:t>
+      </w:r>
+      <w:r>
+        <w:t>.</w:t>
+      </w:r>
+    </w:p>
+    <w:p>
+      <w:pPr>
+        <w:pStyle w:val="Titre2"/>
+      </w:pPr>
+      <w:r>
+        <w:t>Domaine et source de données</w:t>
+      </w:r>
+    </w:p>
+    <w:p>
+      <w:pPr>
+        <w:pStyle w:val="Retraitcorpsdetexte"/>
+      </w:pPr>
+      <w:r>
+        <w:t xml:space="preserve">Le domaine choisi est la </w:t>
+      </w:r>
+      <w:r>
+        <w:rPr>
+          <w:b/>
+          <w:bCs/>
+        </w:rPr>
+        <w:t>finance</w:t>
+      </w:r>
+      <w:r>
+        <w:t>, plus précisément l'analyse boursière des plus grandes entreprises mondiales par capitalisation boursière (Big Tech).</w:t>
+      </w:r>
+    </w:p>
+    <w:p>
+      <w:pPr>
+        <w:pStyle w:val="Retraitcorpsdetexte"/>
+      </w:pPr>
+    </w:p>
+    <w:p>
+      <w:pPr>
+        <w:pStyle w:val="Retraitcorpsdetexte"/>
+      </w:pPr>
+      <w:r>
+        <w:t>L’application exploite 5(ou plus) séries temporelles cohérentes (500+ valeurs chacune) :</w:t>
+      </w:r>
+    </w:p>
+    <w:p>
+      <w:pPr>
+        <w:pStyle w:val="Retraitcorpsdetexte"/>
+      </w:pPr>
+    </w:p>
+    <w:p>
+      <w:pPr>
+        <w:pStyle w:val="Retraitcorpsdetexte"/>
+        <w:numPr>
+          <w:ilvl w:val="0"/>
+          <w:numId w:val="48"/>
+        </w:numPr>
+      </w:pPr>
+      <w:r>
+        <w:t>Nvidia</w:t>
+      </w:r>
+    </w:p>
+    <w:p>
+      <w:pPr>
+        <w:pStyle w:val="Retraitcorpsdetexte"/>
+        <w:numPr>
+          <w:ilvl w:val="0"/>
+          <w:numId w:val="48"/>
+        </w:numPr>
+      </w:pPr>
+      <w:r>
+        <w:t>Apple</w:t>
+      </w:r>
+    </w:p>
+    <w:p>
+      <w:pPr>
+        <w:pStyle w:val="Retraitcorpsdetexte"/>
+        <w:numPr>
+          <w:ilvl w:val="0"/>
+          <w:numId w:val="48"/>
+        </w:numPr>
+      </w:pPr>
+      <w:r>
+        <w:t>Microsoft</w:t>
+      </w:r>
+    </w:p>
+    <w:p>
+      <w:pPr>
+        <w:pStyle w:val="Retraitcorpsdetexte"/>
+        <w:numPr>
+          <w:ilvl w:val="0"/>
+          <w:numId w:val="48"/>
+        </w:numPr>
+      </w:pPr>
+      <w:r>
+        <w:t>Google</w:t>
+      </w:r>
+    </w:p>
+    <w:p>
+      <w:pPr>
+        <w:pStyle w:val="Retraitcorpsdetexte"/>
+        <w:numPr>
+          <w:ilvl w:val="0"/>
+          <w:numId w:val="48"/>
+        </w:numPr>
+      </w:pPr>
+      <w:r>
+        <w:t>Amazon</w:t>
+      </w:r>
+    </w:p>
+    <w:p>
+      <w:pPr>
+        <w:pStyle w:val="Retraitcorpsdetexte"/>
+        <w:numPr>
+          <w:ilvl w:val="0"/>
+          <w:numId w:val="48"/>
+        </w:numPr>
+      </w:pPr>
+      <w:r>
+        <w:t>…</w:t>
+      </w:r>
+    </w:p>
+    <w:p>
+      <w:pPr>
+        <w:pStyle w:val="Retraitcorpsdetexte"/>
+      </w:pPr>
+    </w:p>
+    <w:p>
+      <w:pPr>
+        <w:pStyle w:val="Retraitcorpsdetexte"/>
+      </w:pPr>
+      <w:r>
+        <w:t>Ces 5 entreprises dominent les indices mondiaux</w:t>
+      </w:r>
+      <w:r>
+        <w:t>.</w:t>
+      </w:r>
+    </w:p>
+    <w:p>
+      <w:pPr>
+        <w:pStyle w:val="Retraitcorpsdetexte"/>
+      </w:pPr>
+      <w:r>
+        <w:t xml:space="preserve">Les afficher ensemble permet </w:t>
+      </w:r>
+      <w:r>
+        <w:t>de</w:t>
+      </w:r>
+      <w:r>
+        <w:t xml:space="preserve"> comparer la croissance entre les concurrents. </w:t>
+      </w:r>
+    </w:p>
+    <w:p>
+      <w:pPr>
+        <w:pStyle w:val="Retraitcorpsdetexte"/>
+      </w:pPr>
+    </w:p>
+    <w:p>
+      <w:pPr>
+        <w:pStyle w:val="Retraitcorpsdetexte"/>
+      </w:pPr>
+      <w:r>
+        <w:rPr>
+          <w:b/>
+          <w:bCs/>
+        </w:rPr>
+        <w:t>Sources des données</w:t>
+      </w:r>
+      <w:r>
+        <w:rPr>
+          <w:b/>
+          <w:bCs/>
+        </w:rPr>
+        <w:t xml:space="preserve"> –</w:t>
+      </w:r>
+      <w:r>
+        <w:t xml:space="preserve"> Fichiers .csv ou json exporté depuis Yahoo Finance</w:t>
+      </w:r>
+      <w:r>
+        <w:t xml:space="preserve"> </w:t>
+      </w:r>
+      <w:r>
+        <w:t>et données en direct via une API financière</w:t>
+      </w:r>
+      <w:r>
+        <w:t xml:space="preserve">. </w:t>
+      </w:r>
+    </w:p>
+    <w:p>
+      <w:pPr>
+        <w:pStyle w:val="Retraitcorpsdetexte"/>
+      </w:pPr>
     </w:p>
     <w:p>
       <w:pPr>
@@ -2138,7 +2318,7 @@
         <w:t>Objectif produit</w:t>
       </w:r>
       <w:r>
-        <w:t xml:space="preserve"> : Créer une application simple et rapide pour importer des données, les enregistrer en stockage locale pour travailler hors ligne, et afficher plusieurs courbes en même temps à l’aide de la librairie ScottPlot. </w:t>
+        <w:t xml:space="preserve"> : Créer une application simple et rapide pour importer des données, les enregistrer en stockage local pour travailler hors ligne, et afficher plusieurs courbes en même temps à l’aide de la librairie ScottPlot. </w:t>
       </w:r>
     </w:p>
     <w:p>
@@ -2431,7 +2611,11 @@
               <w:ind w:left="0"/>
             </w:pPr>
             <w:r>
+              <w:lastRenderedPageBreak/>
               <w:t>Semaine 8</w:t>
+            </w:r>
+            <w:r>
+              <w:t xml:space="preserve"> (après les vacances)</w:t>
             </w:r>
           </w:p>
         </w:tc>
@@ -2447,6 +2631,9 @@
             <w:r>
               <w:t>Améliorations</w:t>
             </w:r>
+            <w:r>
+              <w:t xml:space="preserve"> et rendu du projet</w:t>
+            </w:r>
           </w:p>
         </w:tc>
       </w:tr>
@@ -2462,7 +2649,13 @@
       </w:pPr>
       <w:bookmarkStart w:id="8" w:name="_Toc71040027"/>
       <w:r>
-        <w:t>Analyse fonctionnele</w:t>
+        <w:t>Analyse fonctionnel</w:t>
+      </w:r>
+      <w:r>
+        <w:t>l</w:t>
+      </w:r>
+      <w:r>
+        <w:t>e</w:t>
       </w:r>
     </w:p>
     <w:p>
@@ -2480,13 +2673,7 @@
     </w:p>
     <w:p>
       <w:r>
-        <w:t xml:space="preserve">Je veux pouvoir facilement et d'une manière simple ajouter ma </w:t>
-      </w:r>
-      <w:r>
-        <w:t>série</w:t>
-      </w:r>
-      <w:r>
-        <w:t xml:space="preserve"> de données dans le programme.</w:t>
+        <w:t>Je veux pouvoir facilement et d'une manière simple ajouter ma serie de données dans le programme.</w:t>
       </w:r>
     </w:p>
     <w:p>
@@ -2497,29 +2684,19 @@
     <w:p/>
     <w:p>
       <w:r>
-        <w:t>•   Sur la page principale, dans le menu</w:t>
-      </w:r>
-      <w:r>
-        <w:t xml:space="preserve"> </w:t>
-      </w:r>
-      <w:r>
-        <w:t>"Fichier" je vois l'option appelé "Importer un fichier")</w:t>
-      </w:r>
-    </w:p>
-    <w:p>
-      <w:r>
-        <w:t>•   En cliquant sur ce bouton, il y a une fenêtre d'explorateur de fichiers qui apparaît, avec le filtre sur les fichiers .</w:t>
-      </w:r>
-      <w:proofErr w:type="gramStart"/>
-      <w:r>
-        <w:t>csv .</w:t>
-      </w:r>
-      <w:proofErr w:type="spellStart"/>
-      <w:r>
-        <w:t>json</w:t>
-      </w:r>
-      <w:proofErr w:type="spellEnd"/>
-      <w:proofErr w:type="gramEnd"/>
+        <w:t>•   Sur la page principale, dans le menu"Fichier" je vois l'option appelé</w:t>
+      </w:r>
+      <w:r>
+        <w:t>e</w:t>
+      </w:r>
+      <w:r>
+        <w:t xml:space="preserve"> "Importer un fichier")</w:t>
+      </w:r>
+    </w:p>
+    <w:p>
+      <w:r>
+        <w:t>•   En cliquant sur ce bouton, il y a une fenêtre d'explorateur de fichiers qui apparaît, avec le filtre sur les fichiers .csv .json</w:t>
+      </w:r>
     </w:p>
     <w:p>
       <w:r>
@@ -2539,8 +2716,8 @@
           <w:noProof/>
         </w:rPr>
         <w:drawing>
-          <wp:inline distT="0" distB="0" distL="0" distR="0" wp14:anchorId="566B859F" wp14:editId="75F2062A">
-            <wp:extent cx="4762500" cy="2838450"/>
+          <wp:inline distT="0" distB="0" distL="0" distR="0" wp14:anchorId="47476D2B" wp14:editId="1A33F5FF">
+            <wp:extent cx="4762500" cy="2895600"/>
             <wp:effectExtent l="0" t="0" r="0" b="0"/>
             <wp:docPr id="1" name="Image 1"/>
             <wp:cNvGraphicFramePr>
@@ -2565,7 +2742,7 @@
                   <pic:spPr bwMode="auto">
                     <a:xfrm>
                       <a:off x="0" y="0"/>
-                      <a:ext cx="4762500" cy="2838450"/>
+                      <a:ext cx="4762500" cy="2895600"/>
                     </a:xfrm>
                     <a:prstGeom prst="rect">
                       <a:avLst/>
@@ -2595,15 +2772,7 @@
     </w:p>
     <w:p>
       <w:r>
-        <w:t xml:space="preserve">Je veux pouvoir masquer une </w:t>
-      </w:r>
-      <w:proofErr w:type="spellStart"/>
-      <w:r>
-        <w:t>serie</w:t>
-      </w:r>
-      <w:proofErr w:type="spellEnd"/>
-      <w:r>
-        <w:t xml:space="preserve"> de la vue active,</w:t>
+        <w:t>Je veux pouvoir masquer une serie de la vue active,</w:t>
       </w:r>
     </w:p>
     <w:p>
@@ -2614,15 +2783,7 @@
     <w:p/>
     <w:p>
       <w:r>
-        <w:t xml:space="preserve">•   Une liste </w:t>
-      </w:r>
-      <w:proofErr w:type="spellStart"/>
-      <w:r>
-        <w:t>cochable</w:t>
-      </w:r>
-      <w:proofErr w:type="spellEnd"/>
-      <w:r>
-        <w:t xml:space="preserve"> de suppression retire une courbe du graphique immédiatement.</w:t>
+        <w:t>•   Une liste cochable de suppression retire une courbe du graphique immédiatement.</w:t>
       </w:r>
     </w:p>
     <w:p/>
@@ -2632,11 +2793,12 @@
         <w:rPr>
           <w:noProof/>
         </w:rPr>
+        <w:lastRenderedPageBreak/>
         <w:drawing>
-          <wp:inline distT="0" distB="0" distL="0" distR="0" wp14:anchorId="60E37E8E" wp14:editId="127AECD3">
-            <wp:extent cx="4762500" cy="2847975"/>
+          <wp:inline distT="0" distB="0" distL="0" distR="0" wp14:anchorId="5670F647" wp14:editId="46A4D5F0">
+            <wp:extent cx="4762500" cy="2867025"/>
             <wp:effectExtent l="0" t="0" r="0" b="0"/>
-            <wp:docPr id="1060780211" name="Image 1060780211"/>
+            <wp:docPr id="1598930934" name="Image 1598930934"/>
             <wp:cNvGraphicFramePr>
               <a:graphicFrameLocks xmlns:a="http://schemas.openxmlformats.org/drawingml/2006/main" noChangeAspect="1"/>
             </wp:cNvGraphicFramePr>
@@ -2659,7 +2821,7 @@
                   <pic:spPr bwMode="auto">
                     <a:xfrm>
                       <a:off x="0" y="0"/>
-                      <a:ext cx="4762500" cy="2847975"/>
+                      <a:ext cx="4762500" cy="2867025"/>
                     </a:xfrm>
                     <a:prstGeom prst="rect">
                       <a:avLst/>
@@ -2694,7 +2856,6 @@
     </w:p>
     <w:p>
       <w:r>
-        <w:lastRenderedPageBreak/>
         <w:t>Afin de pouvoir mieux analyser les données</w:t>
       </w:r>
     </w:p>
@@ -2722,10 +2883,10 @@
           <w:noProof/>
         </w:rPr>
         <w:drawing>
-          <wp:inline distT="0" distB="0" distL="0" distR="0" wp14:anchorId="10DC08F6" wp14:editId="64508295">
-            <wp:extent cx="4762500" cy="1895475"/>
+          <wp:inline distT="0" distB="0" distL="0" distR="0" wp14:anchorId="3CB0315A" wp14:editId="4E622961">
+            <wp:extent cx="4762500" cy="2876550"/>
             <wp:effectExtent l="0" t="0" r="0" b="0"/>
-            <wp:docPr id="2080967850" name="Image 2080967850"/>
+            <wp:docPr id="61517651" name="Image 61517651"/>
             <wp:cNvGraphicFramePr>
               <a:graphicFrameLocks xmlns:a="http://schemas.openxmlformats.org/drawingml/2006/main" noChangeAspect="1"/>
             </wp:cNvGraphicFramePr>
@@ -2748,7 +2909,7 @@
                   <pic:spPr bwMode="auto">
                     <a:xfrm>
                       <a:off x="0" y="0"/>
-                      <a:ext cx="4762500" cy="1895475"/>
+                      <a:ext cx="4762500" cy="2876550"/>
                     </a:xfrm>
                     <a:prstGeom prst="rect">
                       <a:avLst/>
@@ -2768,13 +2929,12 @@
         <w:pStyle w:val="Titre2"/>
       </w:pPr>
       <w:r>
+        <w:lastRenderedPageBreak/>
         <w:t xml:space="preserve">#4 — Labels </w:t>
       </w:r>
-      <w:proofErr w:type="gramStart"/>
-      <w:r>
-        <w:t>des graphique</w:t>
-      </w:r>
-      <w:proofErr w:type="gramEnd"/>
+      <w:r>
+        <w:t>des graphiques</w:t>
+      </w:r>
     </w:p>
     <w:p>
       <w:r>
@@ -2799,15 +2959,7 @@
     </w:p>
     <w:p>
       <w:r>
-        <w:t>•   Afficher ou masquer une série -</w:t>
-      </w:r>
-      <w:proofErr w:type="gramStart"/>
-      <w:r>
-        <w:t>&gt;  La</w:t>
-      </w:r>
-      <w:proofErr w:type="gramEnd"/>
-      <w:r>
-        <w:t xml:space="preserve"> légende actualise instantanément le nom et la pastille de couleur correspondante.</w:t>
+        <w:t>•   Afficher ou masquer une série -&gt;  La légende actualise instantanément le nom et la pastille de couleur correspondante.</w:t>
       </w:r>
     </w:p>
     <w:p/>
@@ -2818,10 +2970,10 @@
           <w:noProof/>
         </w:rPr>
         <w:drawing>
-          <wp:inline distT="0" distB="0" distL="0" distR="0" wp14:anchorId="7FAE7753" wp14:editId="6324AC41">
-            <wp:extent cx="4762500" cy="2400300"/>
+          <wp:inline distT="0" distB="0" distL="0" distR="0" wp14:anchorId="26DA465B" wp14:editId="1EC9DBEA">
+            <wp:extent cx="4762500" cy="2876550"/>
             <wp:effectExtent l="0" t="0" r="0" b="0"/>
-            <wp:docPr id="968844048" name="Image 968844048"/>
+            <wp:docPr id="1121760416" name="Image 1121760416"/>
             <wp:cNvGraphicFramePr>
               <a:graphicFrameLocks xmlns:a="http://schemas.openxmlformats.org/drawingml/2006/main" noChangeAspect="1"/>
             </wp:cNvGraphicFramePr>
@@ -2844,7 +2996,7 @@
                   <pic:spPr bwMode="auto">
                     <a:xfrm>
                       <a:off x="0" y="0"/>
-                      <a:ext cx="4762500" cy="2400300"/>
+                      <a:ext cx="4762500" cy="2876550"/>
                     </a:xfrm>
                     <a:prstGeom prst="rect">
                       <a:avLst/>
@@ -2874,7 +3026,6 @@
     </w:p>
     <w:p>
       <w:r>
-        <w:lastRenderedPageBreak/>
         <w:t>Je veux pouvoir récupérer et intégrer un jeu de données directement depuis une API externe.</w:t>
       </w:r>
     </w:p>
@@ -2911,11 +3062,12 @@
         <w:rPr>
           <w:noProof/>
         </w:rPr>
+        <w:lastRenderedPageBreak/>
         <w:drawing>
-          <wp:inline distT="0" distB="0" distL="0" distR="0" wp14:anchorId="10F11242" wp14:editId="0B561CE3">
-            <wp:extent cx="4762500" cy="2905125"/>
+          <wp:inline distT="0" distB="0" distL="0" distR="0" wp14:anchorId="41066518" wp14:editId="2D610F54">
+            <wp:extent cx="4762500" cy="2876550"/>
             <wp:effectExtent l="0" t="0" r="0" b="0"/>
-            <wp:docPr id="1338732340" name="Image 1338732340"/>
+            <wp:docPr id="1097146422" name="Image 1097146422"/>
             <wp:cNvGraphicFramePr>
               <a:graphicFrameLocks xmlns:a="http://schemas.openxmlformats.org/drawingml/2006/main" noChangeAspect="1"/>
             </wp:cNvGraphicFramePr>
@@ -2938,6 +3090,227 @@
                   <pic:spPr bwMode="auto">
                     <a:xfrm>
                       <a:off x="0" y="0"/>
+                      <a:ext cx="4762500" cy="2876550"/>
+                    </a:xfrm>
+                    <a:prstGeom prst="rect">
+                      <a:avLst/>
+                    </a:prstGeom>
+                  </pic:spPr>
+                </pic:pic>
+              </a:graphicData>
+            </a:graphic>
+          </wp:inline>
+        </w:drawing>
+      </w:r>
+    </w:p>
+    <w:p>
+      <w:pPr>
+        <w:pStyle w:val="Titre2"/>
+      </w:pPr>
+      <w:r>
+        <w:t>#6 — Saisie manuelle d'un nouveau point</w:t>
+      </w:r>
+    </w:p>
+    <w:p>
+      <w:r>
+        <w:t>En tant qu’utilisateur,</w:t>
+      </w:r>
+    </w:p>
+    <w:p>
+      <w:r>
+        <w:t>Je veux pouvoir saisir manuellement un point (date/heure et valeur) dans une série déjà enregistrée,</w:t>
+      </w:r>
+    </w:p>
+    <w:p>
+      <w:r>
+        <w:t>Afin de compléter ou corriger mes données locales hors ligne.</w:t>
+      </w:r>
+    </w:p>
+    <w:p/>
+    <w:p>
+      <w:r>
+        <w:t>•   Un formulaire simple permet de sélectionner la série, d'entrer la date et la valeur numérique.</w:t>
+      </w:r>
+    </w:p>
+    <w:p>
+      <w:r>
+        <w:t>•   Le graphique et le fichier local se mettent à jour automatiquement.</w:t>
+      </w:r>
+    </w:p>
+    <w:p/>
+    <w:p/>
+    <w:p>
+      <w:r>
+        <w:rPr>
+          <w:noProof/>
+        </w:rPr>
+        <w:drawing>
+          <wp:inline distT="0" distB="0" distL="0" distR="0" wp14:anchorId="1DAC9376" wp14:editId="00A1C8D3">
+            <wp:extent cx="4762500" cy="2857500"/>
+            <wp:effectExtent l="0" t="0" r="0" b="0"/>
+            <wp:docPr id="945681730" name="Image 945681730"/>
+            <wp:cNvGraphicFramePr>
+              <a:graphicFrameLocks xmlns:a="http://schemas.openxmlformats.org/drawingml/2006/main" noChangeAspect="1"/>
+            </wp:cNvGraphicFramePr>
+            <a:graphic xmlns:a="http://schemas.openxmlformats.org/drawingml/2006/main">
+              <a:graphicData uri="http://schemas.openxmlformats.org/drawingml/2006/picture">
+                <pic:pic xmlns:pic="http://schemas.openxmlformats.org/drawingml/2006/picture">
+                  <pic:nvPicPr>
+                    <pic:cNvPr id="0" name=""/>
+                    <pic:cNvPicPr>
+                      <a:picLocks noChangeAspect="1" noChangeArrowheads="1"/>
+                    </pic:cNvPicPr>
+                  </pic:nvPicPr>
+                  <pic:blipFill>
+                    <a:blip r:embed="rId17"/>
+                    <a:srcRect/>
+                    <a:stretch>
+                      <a:fillRect/>
+                    </a:stretch>
+                  </pic:blipFill>
+                  <pic:spPr bwMode="auto">
+                    <a:xfrm>
+                      <a:off x="0" y="0"/>
+                      <a:ext cx="4762500" cy="2857500"/>
+                    </a:xfrm>
+                    <a:prstGeom prst="rect">
+                      <a:avLst/>
+                    </a:prstGeom>
+                  </pic:spPr>
+                </pic:pic>
+              </a:graphicData>
+            </a:graphic>
+          </wp:inline>
+        </w:drawing>
+      </w:r>
+    </w:p>
+    <w:p/>
+    <w:p>
+      <w:r>
+        <w:rPr>
+          <w:noProof/>
+        </w:rPr>
+        <w:lastRenderedPageBreak/>
+        <w:drawing>
+          <wp:inline distT="0" distB="0" distL="0" distR="0" wp14:anchorId="59A1E78B" wp14:editId="44118777">
+            <wp:extent cx="3466214" cy="2426350"/>
+            <wp:effectExtent l="0" t="0" r="1270" b="0"/>
+            <wp:docPr id="1753427558" name="Image 1753427558"/>
+            <wp:cNvGraphicFramePr>
+              <a:graphicFrameLocks xmlns:a="http://schemas.openxmlformats.org/drawingml/2006/main" noChangeAspect="1"/>
+            </wp:cNvGraphicFramePr>
+            <a:graphic xmlns:a="http://schemas.openxmlformats.org/drawingml/2006/main">
+              <a:graphicData uri="http://schemas.openxmlformats.org/drawingml/2006/picture">
+                <pic:pic xmlns:pic="http://schemas.openxmlformats.org/drawingml/2006/picture">
+                  <pic:nvPicPr>
+                    <pic:cNvPr id="0" name=""/>
+                    <pic:cNvPicPr>
+                      <a:picLocks noChangeAspect="1" noChangeArrowheads="1"/>
+                    </pic:cNvPicPr>
+                  </pic:nvPicPr>
+                  <pic:blipFill>
+                    <a:blip r:embed="rId18"/>
+                    <a:srcRect/>
+                    <a:stretch>
+                      <a:fillRect/>
+                    </a:stretch>
+                  </pic:blipFill>
+                  <pic:spPr bwMode="auto">
+                    <a:xfrm>
+                      <a:off x="0" y="0"/>
+                      <a:ext cx="3468535" cy="2427975"/>
+                    </a:xfrm>
+                    <a:prstGeom prst="rect">
+                      <a:avLst/>
+                    </a:prstGeom>
+                  </pic:spPr>
+                </pic:pic>
+              </a:graphicData>
+            </a:graphic>
+          </wp:inline>
+        </w:drawing>
+      </w:r>
+    </w:p>
+    <w:p/>
+    <w:p/>
+    <w:p>
+      <w:pPr>
+        <w:pStyle w:val="Titre2"/>
+      </w:pPr>
+      <w:r>
+        <w:t>#7 — Exportation en PNG</w:t>
+      </w:r>
+    </w:p>
+    <w:p>
+      <w:r>
+        <w:t>En tant qu'utilisateur,</w:t>
+      </w:r>
+    </w:p>
+    <w:p>
+      <w:r>
+        <w:t>Je veux pouvoir exporter le graphique affiché sous forme d'image au format .png,</w:t>
+      </w:r>
+    </w:p>
+    <w:p>
+      <w:r>
+        <w:t>Afin d'enregistrer mes visualisations pour les partager ou les insérer dans un rapport</w:t>
+      </w:r>
+    </w:p>
+    <w:p/>
+    <w:p>
+      <w:r>
+        <w:t>•   Sur la page principale, je clique sur le bouton « Exporter en PNG ».</w:t>
+      </w:r>
+    </w:p>
+    <w:p>
+      <w:r>
+        <w:t>•   Une fenêtre de sauvegarde de fichier s'affiche pour choisir le nom du fichier et l'emplacement sur l'ordinateur.</w:t>
+      </w:r>
+    </w:p>
+    <w:p>
+      <w:r>
+        <w:t>•   Après validation, l'image exacte du graphique affiché à l'écran est enregistrée.</w:t>
+      </w:r>
+    </w:p>
+    <w:p>
+      <w:r>
+        <w:t>•   Si l'enregistrement échoue un message d'erreur explicite s'affiche au centre.</w:t>
+      </w:r>
+    </w:p>
+    <w:p/>
+    <w:p/>
+    <w:p>
+      <w:r>
+        <w:rPr>
+          <w:noProof/>
+        </w:rPr>
+        <w:drawing>
+          <wp:inline distT="0" distB="0" distL="0" distR="0" wp14:anchorId="3B14C45D" wp14:editId="26BE002C">
+            <wp:extent cx="4762500" cy="2905125"/>
+            <wp:effectExtent l="0" t="0" r="0" b="0"/>
+            <wp:docPr id="920071414" name="Image 920071414"/>
+            <wp:cNvGraphicFramePr>
+              <a:graphicFrameLocks xmlns:a="http://schemas.openxmlformats.org/drawingml/2006/main" noChangeAspect="1"/>
+            </wp:cNvGraphicFramePr>
+            <a:graphic xmlns:a="http://schemas.openxmlformats.org/drawingml/2006/main">
+              <a:graphicData uri="http://schemas.openxmlformats.org/drawingml/2006/picture">
+                <pic:pic xmlns:pic="http://schemas.openxmlformats.org/drawingml/2006/picture">
+                  <pic:nvPicPr>
+                    <pic:cNvPr id="0" name=""/>
+                    <pic:cNvPicPr>
+                      <a:picLocks noChangeAspect="1" noChangeArrowheads="1"/>
+                    </pic:cNvPicPr>
+                  </pic:nvPicPr>
+                  <pic:blipFill>
+                    <a:blip r:embed="rId19"/>
+                    <a:srcRect/>
+                    <a:stretch>
+                      <a:fillRect/>
+                    </a:stretch>
+                  </pic:blipFill>
+                  <pic:spPr bwMode="auto">
+                    <a:xfrm>
+                      <a:off x="0" y="0"/>
                       <a:ext cx="4762500" cy="2905125"/>
                     </a:xfrm>
                     <a:prstGeom prst="rect">
@@ -2953,6 +3326,7 @@
     </w:p>
     <w:p/>
     <w:p/>
+    <w:p/>
     <w:p>
       <w:pPr>
         <w:pStyle w:val="Corpsdetexte"/>
@@ -2963,6 +3337,7 @@
         <w:pStyle w:val="Titre1"/>
       </w:pPr>
       <w:r>
+        <w:lastRenderedPageBreak/>
         <w:t>Points techniques</w:t>
       </w:r>
       <w:bookmarkEnd w:id="8"/>
@@ -3049,14 +3424,9 @@
       <w:bookmarkStart w:id="16" w:name="_Toc165969652"/>
       <w:bookmarkStart w:id="17" w:name="_Ref308525868"/>
       <w:r>
-        <w:t xml:space="preserve">Points techniques évalués du </w:t>
-      </w:r>
-      <w:proofErr w:type="spellStart"/>
-      <w:r>
-        <w:t>CdC</w:t>
+        <w:t>Points techniques évalués du CdC</w:t>
       </w:r>
       <w:bookmarkEnd w:id="14"/>
-      <w:proofErr w:type="spellEnd"/>
     </w:p>
     <w:p>
       <w:pPr>
@@ -3067,13 +3437,8 @@
         </w:numPr>
       </w:pPr>
       <w:r>
-        <w:t xml:space="preserve">Copier du </w:t>
-      </w:r>
-      <w:proofErr w:type="spellStart"/>
-      <w:r>
-        <w:t>CdC</w:t>
-      </w:r>
-      <w:proofErr w:type="spellEnd"/>
+        <w:t>Copier du CdC</w:t>
+      </w:r>
     </w:p>
     <w:p>
       <w:pPr>
@@ -3131,7 +3496,6 @@
       </w:pPr>
       <w:bookmarkStart w:id="20" w:name="_Toc71040034"/>
       <w:r>
-        <w:lastRenderedPageBreak/>
         <w:t>Validation client 1</w:t>
       </w:r>
       <w:r>
@@ -3244,15 +3608,7 @@
         </w:numPr>
       </w:pPr>
       <w:r>
-        <w:t xml:space="preserve">Capture de la </w:t>
-      </w:r>
-      <w:proofErr w:type="spellStart"/>
-      <w:r>
-        <w:t>planif</w:t>
-      </w:r>
-      <w:proofErr w:type="spellEnd"/>
-      <w:r>
-        <w:t xml:space="preserve"> finale</w:t>
+        <w:t>Capture de la planif finale</w:t>
       </w:r>
     </w:p>
     <w:p>
@@ -3290,13 +3646,8 @@
         </w:numPr>
       </w:pPr>
       <w:r>
-        <w:t xml:space="preserve">Si c’était à </w:t>
-      </w:r>
-      <w:proofErr w:type="gramStart"/>
-      <w:r>
-        <w:t>refaire:</w:t>
-      </w:r>
-      <w:proofErr w:type="gramEnd"/>
+        <w:t>Si c’était à refaire:</w:t>
+      </w:r>
     </w:p>
     <w:p>
       <w:pPr>
@@ -3342,13 +3693,8 @@
           <w:numId w:val="24"/>
         </w:numPr>
       </w:pPr>
-      <w:proofErr w:type="gramStart"/>
-      <w:r>
-        <w:t>Suite à</w:t>
-      </w:r>
-      <w:proofErr w:type="gramEnd"/>
-      <w:r>
-        <w:t xml:space="preserve"> donner, améliorations souhaitables, …</w:t>
+      <w:r>
+        <w:t>Suite à donner, améliorations souhaitables, …</w:t>
       </w:r>
     </w:p>
     <w:p>
@@ -3385,13 +3731,8 @@
         </w:numPr>
       </w:pPr>
       <w:r>
-        <w:t xml:space="preserve">Si c’était à </w:t>
-      </w:r>
-      <w:proofErr w:type="gramStart"/>
-      <w:r>
-        <w:t>refaire:</w:t>
-      </w:r>
-      <w:proofErr w:type="gramEnd"/>
+        <w:t>Si c’était à refaire:</w:t>
+      </w:r>
     </w:p>
     <w:p>
       <w:pPr>
@@ -3437,13 +3778,8 @@
           <w:numId w:val="24"/>
         </w:numPr>
       </w:pPr>
-      <w:proofErr w:type="gramStart"/>
-      <w:r>
-        <w:t>Suite à</w:t>
-      </w:r>
-      <w:proofErr w:type="gramEnd"/>
-      <w:r>
-        <w:t xml:space="preserve"> donner, améliorations souhaitables, …</w:t>
+      <w:r>
+        <w:t>Suite à donner, améliorations souhaitables, …</w:t>
       </w:r>
     </w:p>
     <w:p>
@@ -3481,16 +3817,11 @@
         </w:numPr>
       </w:pPr>
       <w:r>
-        <w:t xml:space="preserve">Si c’était à </w:t>
-      </w:r>
-      <w:proofErr w:type="gramStart"/>
-      <w:r>
-        <w:t>refaire</w:t>
+        <w:t>Si c’était à refaire</w:t>
       </w:r>
       <w:r>
         <w:t>:</w:t>
       </w:r>
-      <w:proofErr w:type="gramEnd"/>
     </w:p>
     <w:p>
       <w:pPr>
@@ -3557,13 +3888,8 @@
           <w:numId w:val="24"/>
         </w:numPr>
       </w:pPr>
-      <w:proofErr w:type="gramStart"/>
-      <w:r>
-        <w:t>Suite à</w:t>
-      </w:r>
-      <w:proofErr w:type="gramEnd"/>
-      <w:r>
-        <w:t xml:space="preserve"> donner, améliorations souhaitables, …</w:t>
+      <w:r>
+        <w:t>Suite à donner, améliorations souhaitables, …</w:t>
       </w:r>
     </w:p>
     <w:p>
@@ -3586,6 +3912,7 @@
       <w:bookmarkStart w:id="32" w:name="_Toc165969657"/>
       <w:bookmarkStart w:id="33" w:name="_Toc71040041"/>
       <w:r>
+        <w:lastRenderedPageBreak/>
         <w:t>Divers</w:t>
       </w:r>
       <w:bookmarkEnd w:id="31"/>
@@ -3615,8 +3942,8 @@
       </w:r>
     </w:p>
     <w:sectPr>
-      <w:headerReference w:type="default" r:id="rId17"/>
-      <w:footerReference w:type="default" r:id="rId18"/>
+      <w:headerReference w:type="default" r:id="rId20"/>
+      <w:footerReference w:type="default" r:id="rId21"/>
       <w:pgSz w:w="11906" w:h="16838" w:code="9"/>
       <w:pgMar w:top="1418" w:right="1418" w:bottom="1418" w:left="1418" w:header="709" w:footer="709" w:gutter="0"/>
       <w:cols w:space="708"/>
@@ -4039,21 +4366,12 @@
               <w:szCs w:val="16"/>
             </w:rPr>
           </w:pPr>
-          <w:proofErr w:type="gramStart"/>
           <w:r>
             <w:rPr>
               <w:rFonts w:cs="Arial"/>
               <w:szCs w:val="16"/>
             </w:rPr>
-            <w:t>Version:</w:t>
-          </w:r>
-          <w:proofErr w:type="gramEnd"/>
-          <w:r>
-            <w:rPr>
-              <w:rFonts w:cs="Arial"/>
-              <w:szCs w:val="16"/>
-            </w:rPr>
-            <w:t xml:space="preserve"> </w:t>
+            <w:t xml:space="preserve">Version: </w:t>
           </w:r>
           <w:fldSimple w:instr=" REVNUM   \* MERGEFORMAT ">
             <w:r>
@@ -4311,7 +4629,7 @@
         <v:path o:extrusionok="f" gradientshapeok="t" o:connecttype="rect"/>
         <o:lock v:ext="edit" aspectratio="t"/>
       </v:shapetype>
-      <v:shape id="_x0000_i1025" type="#_x0000_t75" style="width:11.5pt;height:11.5pt" o:bullet="t">
+      <v:shape id="_x0000_i1025" type="#_x0000_t75" style="width:11.2pt;height:11.2pt" o:bullet="t">
         <v:imagedata r:id="rId1" o:title="BD10263_"/>
       </v:shape>
     </w:pict>
@@ -4615,6 +4933,119 @@
     </w:lvl>
   </w:abstractNum>
   <w:abstractNum w:abstractNumId="11" w15:restartNumberingAfterBreak="0">
+    <w:nsid w:val="003C19A8"/>
+    <w:multiLevelType w:val="hybridMultilevel"/>
+    <w:tmpl w:val="F40E6886"/>
+    <w:lvl w:ilvl="0" w:tplc="100C0001">
+      <w:start w:val="1"/>
+      <w:numFmt w:val="bullet"/>
+      <w:lvlText w:val=""/>
+      <w:lvlJc w:val="left"/>
+      <w:pPr>
+        <w:ind w:left="1854" w:hanging="360"/>
+      </w:pPr>
+      <w:rPr>
+        <w:rFonts w:ascii="Symbol" w:hAnsi="Symbol" w:hint="default"/>
+      </w:rPr>
+    </w:lvl>
+    <w:lvl w:ilvl="1" w:tplc="100C0003" w:tentative="1">
+      <w:start w:val="1"/>
+      <w:numFmt w:val="bullet"/>
+      <w:lvlText w:val="o"/>
+      <w:lvlJc w:val="left"/>
+      <w:pPr>
+        <w:ind w:left="2574" w:hanging="360"/>
+      </w:pPr>
+      <w:rPr>
+        <w:rFonts w:ascii="Courier New" w:hAnsi="Courier New" w:cs="Courier New" w:hint="default"/>
+      </w:rPr>
+    </w:lvl>
+    <w:lvl w:ilvl="2" w:tplc="100C0005" w:tentative="1">
+      <w:start w:val="1"/>
+      <w:numFmt w:val="bullet"/>
+      <w:lvlText w:val=""/>
+      <w:lvlJc w:val="left"/>
+      <w:pPr>
+        <w:ind w:left="3294" w:hanging="360"/>
+      </w:pPr>
+      <w:rPr>
+        <w:rFonts w:ascii="Wingdings" w:hAnsi="Wingdings" w:hint="default"/>
+      </w:rPr>
+    </w:lvl>
+    <w:lvl w:ilvl="3" w:tplc="100C0001" w:tentative="1">
+      <w:start w:val="1"/>
+      <w:numFmt w:val="bullet"/>
+      <w:lvlText w:val=""/>
+      <w:lvlJc w:val="left"/>
+      <w:pPr>
+        <w:ind w:left="4014" w:hanging="360"/>
+      </w:pPr>
+      <w:rPr>
+        <w:rFonts w:ascii="Symbol" w:hAnsi="Symbol" w:hint="default"/>
+      </w:rPr>
+    </w:lvl>
+    <w:lvl w:ilvl="4" w:tplc="100C0003" w:tentative="1">
+      <w:start w:val="1"/>
+      <w:numFmt w:val="bullet"/>
+      <w:lvlText w:val="o"/>
+      <w:lvlJc w:val="left"/>
+      <w:pPr>
+        <w:ind w:left="4734" w:hanging="360"/>
+      </w:pPr>
+      <w:rPr>
+        <w:rFonts w:ascii="Courier New" w:hAnsi="Courier New" w:cs="Courier New" w:hint="default"/>
+      </w:rPr>
+    </w:lvl>
+    <w:lvl w:ilvl="5" w:tplc="100C0005" w:tentative="1">
+      <w:start w:val="1"/>
+      <w:numFmt w:val="bullet"/>
+      <w:lvlText w:val=""/>
+      <w:lvlJc w:val="left"/>
+      <w:pPr>
+        <w:ind w:left="5454" w:hanging="360"/>
+      </w:pPr>
+      <w:rPr>
+        <w:rFonts w:ascii="Wingdings" w:hAnsi="Wingdings" w:hint="default"/>
+      </w:rPr>
+    </w:lvl>
+    <w:lvl w:ilvl="6" w:tplc="100C0001" w:tentative="1">
+      <w:start w:val="1"/>
+      <w:numFmt w:val="bullet"/>
+      <w:lvlText w:val=""/>
+      <w:lvlJc w:val="left"/>
+      <w:pPr>
+        <w:ind w:left="6174" w:hanging="360"/>
+      </w:pPr>
+      <w:rPr>
+        <w:rFonts w:ascii="Symbol" w:hAnsi="Symbol" w:hint="default"/>
+      </w:rPr>
+    </w:lvl>
+    <w:lvl w:ilvl="7" w:tplc="100C0003" w:tentative="1">
+      <w:start w:val="1"/>
+      <w:numFmt w:val="bullet"/>
+      <w:lvlText w:val="o"/>
+      <w:lvlJc w:val="left"/>
+      <w:pPr>
+        <w:ind w:left="6894" w:hanging="360"/>
+      </w:pPr>
+      <w:rPr>
+        <w:rFonts w:ascii="Courier New" w:hAnsi="Courier New" w:cs="Courier New" w:hint="default"/>
+      </w:rPr>
+    </w:lvl>
+    <w:lvl w:ilvl="8" w:tplc="100C0005" w:tentative="1">
+      <w:start w:val="1"/>
+      <w:numFmt w:val="bullet"/>
+      <w:lvlText w:val=""/>
+      <w:lvlJc w:val="left"/>
+      <w:pPr>
+        <w:ind w:left="7614" w:hanging="360"/>
+      </w:pPr>
+      <w:rPr>
+        <w:rFonts w:ascii="Wingdings" w:hAnsi="Wingdings" w:hint="default"/>
+      </w:rPr>
+    </w:lvl>
+  </w:abstractNum>
+  <w:abstractNum w:abstractNumId="12" w15:restartNumberingAfterBreak="0">
     <w:nsid w:val="02202AAE"/>
     <w:multiLevelType w:val="multilevel"/>
     <w:tmpl w:val="C2ACEA3A"/>
@@ -4759,7 +5190,7 @@
       </w:rPr>
     </w:lvl>
   </w:abstractNum>
-  <w:abstractNum w:abstractNumId="12" w15:restartNumberingAfterBreak="0">
+  <w:abstractNum w:abstractNumId="13" w15:restartNumberingAfterBreak="0">
     <w:nsid w:val="037669EE"/>
     <w:multiLevelType w:val="multilevel"/>
     <w:tmpl w:val="100C0021"/>
@@ -4872,7 +5303,7 @@
       </w:rPr>
     </w:lvl>
   </w:abstractNum>
-  <w:abstractNum w:abstractNumId="13" w15:restartNumberingAfterBreak="0">
+  <w:abstractNum w:abstractNumId="14" w15:restartNumberingAfterBreak="0">
     <w:nsid w:val="06482CAE"/>
     <w:multiLevelType w:val="multilevel"/>
     <w:tmpl w:val="100C0021"/>
@@ -4985,7 +5416,7 @@
       </w:rPr>
     </w:lvl>
   </w:abstractNum>
-  <w:abstractNum w:abstractNumId="14" w15:restartNumberingAfterBreak="0">
+  <w:abstractNum w:abstractNumId="15" w15:restartNumberingAfterBreak="0">
     <w:nsid w:val="067320D8"/>
     <w:multiLevelType w:val="multilevel"/>
     <w:tmpl w:val="100C0021"/>
@@ -5098,7 +5529,7 @@
       </w:rPr>
     </w:lvl>
   </w:abstractNum>
-  <w:abstractNum w:abstractNumId="15" w15:restartNumberingAfterBreak="0">
+  <w:abstractNum w:abstractNumId="16" w15:restartNumberingAfterBreak="0">
     <w:nsid w:val="0A7C7405"/>
     <w:multiLevelType w:val="singleLevel"/>
     <w:tmpl w:val="92869324"/>
@@ -5119,7 +5550,7 @@
       </w:rPr>
     </w:lvl>
   </w:abstractNum>
-  <w:abstractNum w:abstractNumId="16" w15:restartNumberingAfterBreak="0">
+  <w:abstractNum w:abstractNumId="17" w15:restartNumberingAfterBreak="0">
     <w:nsid w:val="100D77BA"/>
     <w:multiLevelType w:val="hybridMultilevel"/>
     <w:tmpl w:val="B8147694"/>
@@ -5232,7 +5663,7 @@
       </w:rPr>
     </w:lvl>
   </w:abstractNum>
-  <w:abstractNum w:abstractNumId="17" w15:restartNumberingAfterBreak="0">
+  <w:abstractNum w:abstractNumId="18" w15:restartNumberingAfterBreak="0">
     <w:nsid w:val="13386E8A"/>
     <w:multiLevelType w:val="multilevel"/>
     <w:tmpl w:val="100C0021"/>
@@ -5345,7 +5776,7 @@
       </w:rPr>
     </w:lvl>
   </w:abstractNum>
-  <w:abstractNum w:abstractNumId="18" w15:restartNumberingAfterBreak="0">
+  <w:abstractNum w:abstractNumId="19" w15:restartNumberingAfterBreak="0">
     <w:nsid w:val="13AB381A"/>
     <w:multiLevelType w:val="hybridMultilevel"/>
     <w:tmpl w:val="B43857E8"/>
@@ -5488,7 +5919,7 @@
       </w:rPr>
     </w:lvl>
   </w:abstractNum>
-  <w:abstractNum w:abstractNumId="19" w15:restartNumberingAfterBreak="0">
+  <w:abstractNum w:abstractNumId="20" w15:restartNumberingAfterBreak="0">
     <w:nsid w:val="20CB35C8"/>
     <w:multiLevelType w:val="hybridMultilevel"/>
     <w:tmpl w:val="2AA2EA56"/>
@@ -5601,7 +6032,7 @@
       </w:rPr>
     </w:lvl>
   </w:abstractNum>
-  <w:abstractNum w:abstractNumId="20" w15:restartNumberingAfterBreak="0">
+  <w:abstractNum w:abstractNumId="21" w15:restartNumberingAfterBreak="0">
     <w:nsid w:val="2A8F67FD"/>
     <w:multiLevelType w:val="multilevel"/>
     <w:tmpl w:val="08EA5668"/>
@@ -5744,7 +6175,7 @@
       </w:rPr>
     </w:lvl>
   </w:abstractNum>
-  <w:abstractNum w:abstractNumId="21" w15:restartNumberingAfterBreak="0">
+  <w:abstractNum w:abstractNumId="22" w15:restartNumberingAfterBreak="0">
     <w:nsid w:val="2F2C5963"/>
     <w:multiLevelType w:val="multilevel"/>
     <w:tmpl w:val="E2569098"/>
@@ -5857,7 +6288,7 @@
       </w:pPr>
     </w:lvl>
   </w:abstractNum>
-  <w:abstractNum w:abstractNumId="22" w15:restartNumberingAfterBreak="0">
+  <w:abstractNum w:abstractNumId="23" w15:restartNumberingAfterBreak="0">
     <w:nsid w:val="36506853"/>
     <w:multiLevelType w:val="multilevel"/>
     <w:tmpl w:val="2F6EF210"/>
@@ -5970,7 +6401,7 @@
       </w:rPr>
     </w:lvl>
   </w:abstractNum>
-  <w:abstractNum w:abstractNumId="23" w15:restartNumberingAfterBreak="0">
+  <w:abstractNum w:abstractNumId="24" w15:restartNumberingAfterBreak="0">
     <w:nsid w:val="3BD16F36"/>
     <w:multiLevelType w:val="multilevel"/>
     <w:tmpl w:val="100C0021"/>
@@ -6083,7 +6514,7 @@
       </w:rPr>
     </w:lvl>
   </w:abstractNum>
-  <w:abstractNum w:abstractNumId="24" w15:restartNumberingAfterBreak="0">
+  <w:abstractNum w:abstractNumId="25" w15:restartNumberingAfterBreak="0">
     <w:nsid w:val="3C361DED"/>
     <w:multiLevelType w:val="multilevel"/>
     <w:tmpl w:val="100C0021"/>
@@ -6196,7 +6627,7 @@
       </w:rPr>
     </w:lvl>
   </w:abstractNum>
-  <w:abstractNum w:abstractNumId="25" w15:restartNumberingAfterBreak="0">
+  <w:abstractNum w:abstractNumId="26" w15:restartNumberingAfterBreak="0">
     <w:nsid w:val="3EF922F0"/>
     <w:multiLevelType w:val="multilevel"/>
     <w:tmpl w:val="100C0021"/>
@@ -6309,7 +6740,7 @@
       </w:rPr>
     </w:lvl>
   </w:abstractNum>
-  <w:abstractNum w:abstractNumId="26" w15:restartNumberingAfterBreak="0">
+  <w:abstractNum w:abstractNumId="27" w15:restartNumberingAfterBreak="0">
     <w:nsid w:val="486164F4"/>
     <w:multiLevelType w:val="multilevel"/>
     <w:tmpl w:val="100C0021"/>
@@ -6422,7 +6853,7 @@
       </w:rPr>
     </w:lvl>
   </w:abstractNum>
-  <w:abstractNum w:abstractNumId="27" w15:restartNumberingAfterBreak="0">
+  <w:abstractNum w:abstractNumId="28" w15:restartNumberingAfterBreak="0">
     <w:nsid w:val="4C4E14AC"/>
     <w:multiLevelType w:val="multilevel"/>
     <w:tmpl w:val="100C001F"/>
@@ -6508,7 +6939,7 @@
       </w:pPr>
     </w:lvl>
   </w:abstractNum>
-  <w:abstractNum w:abstractNumId="28" w15:restartNumberingAfterBreak="0">
+  <w:abstractNum w:abstractNumId="29" w15:restartNumberingAfterBreak="0">
     <w:nsid w:val="4D30734E"/>
     <w:multiLevelType w:val="multilevel"/>
     <w:tmpl w:val="100C001D"/>
@@ -6594,7 +7025,7 @@
       </w:pPr>
     </w:lvl>
   </w:abstractNum>
-  <w:abstractNum w:abstractNumId="29" w15:restartNumberingAfterBreak="0">
+  <w:abstractNum w:abstractNumId="30" w15:restartNumberingAfterBreak="0">
     <w:nsid w:val="55FE2729"/>
     <w:multiLevelType w:val="multilevel"/>
     <w:tmpl w:val="100C0023"/>
@@ -6681,7 +7112,7 @@
       </w:pPr>
     </w:lvl>
   </w:abstractNum>
-  <w:abstractNum w:abstractNumId="30" w15:restartNumberingAfterBreak="0">
+  <w:abstractNum w:abstractNumId="31" w15:restartNumberingAfterBreak="0">
     <w:nsid w:val="58933B2A"/>
     <w:multiLevelType w:val="multilevel"/>
     <w:tmpl w:val="100C0021"/>
@@ -6794,7 +7225,7 @@
       </w:rPr>
     </w:lvl>
   </w:abstractNum>
-  <w:abstractNum w:abstractNumId="31" w15:restartNumberingAfterBreak="0">
+  <w:abstractNum w:abstractNumId="32" w15:restartNumberingAfterBreak="0">
     <w:nsid w:val="5C877673"/>
     <w:multiLevelType w:val="multilevel"/>
     <w:tmpl w:val="100C0021"/>
@@ -6907,7 +7338,7 @@
       </w:rPr>
     </w:lvl>
   </w:abstractNum>
-  <w:abstractNum w:abstractNumId="32" w15:restartNumberingAfterBreak="0">
+  <w:abstractNum w:abstractNumId="33" w15:restartNumberingAfterBreak="0">
     <w:nsid w:val="5CBC53EC"/>
     <w:multiLevelType w:val="multilevel"/>
     <w:tmpl w:val="2F6EF210"/>
@@ -7020,7 +7451,7 @@
       </w:rPr>
     </w:lvl>
   </w:abstractNum>
-  <w:abstractNum w:abstractNumId="33" w15:restartNumberingAfterBreak="0">
+  <w:abstractNum w:abstractNumId="34" w15:restartNumberingAfterBreak="0">
     <w:nsid w:val="5E424682"/>
     <w:multiLevelType w:val="multilevel"/>
     <w:tmpl w:val="100C001F"/>
@@ -7106,7 +7537,7 @@
       </w:pPr>
     </w:lvl>
   </w:abstractNum>
-  <w:abstractNum w:abstractNumId="34" w15:restartNumberingAfterBreak="0">
+  <w:abstractNum w:abstractNumId="35" w15:restartNumberingAfterBreak="0">
     <w:nsid w:val="63A9062F"/>
     <w:multiLevelType w:val="multilevel"/>
     <w:tmpl w:val="DCCE794A"/>
@@ -7246,7 +7677,7 @@
       </w:rPr>
     </w:lvl>
   </w:abstractNum>
-  <w:abstractNum w:abstractNumId="35" w15:restartNumberingAfterBreak="0">
+  <w:abstractNum w:abstractNumId="36" w15:restartNumberingAfterBreak="0">
     <w:nsid w:val="643F0961"/>
     <w:multiLevelType w:val="multilevel"/>
     <w:tmpl w:val="100C0021"/>
@@ -7359,7 +7790,7 @@
       </w:rPr>
     </w:lvl>
   </w:abstractNum>
-  <w:abstractNum w:abstractNumId="36" w15:restartNumberingAfterBreak="0">
+  <w:abstractNum w:abstractNumId="37" w15:restartNumberingAfterBreak="0">
     <w:nsid w:val="6D6476B9"/>
     <w:multiLevelType w:val="multilevel"/>
     <w:tmpl w:val="100C0023"/>
@@ -7446,7 +7877,7 @@
       </w:pPr>
     </w:lvl>
   </w:abstractNum>
-  <w:abstractNum w:abstractNumId="37" w15:restartNumberingAfterBreak="0">
+  <w:abstractNum w:abstractNumId="38" w15:restartNumberingAfterBreak="0">
     <w:nsid w:val="70C03573"/>
     <w:multiLevelType w:val="multilevel"/>
     <w:tmpl w:val="100C0021"/>
@@ -7559,7 +7990,7 @@
       </w:rPr>
     </w:lvl>
   </w:abstractNum>
-  <w:abstractNum w:abstractNumId="38" w15:restartNumberingAfterBreak="0">
+  <w:abstractNum w:abstractNumId="39" w15:restartNumberingAfterBreak="0">
     <w:nsid w:val="79CD09A9"/>
     <w:multiLevelType w:val="multilevel"/>
     <w:tmpl w:val="100C0021"/>
@@ -7672,7 +8103,7 @@
       </w:rPr>
     </w:lvl>
   </w:abstractNum>
-  <w:abstractNum w:abstractNumId="39" w15:restartNumberingAfterBreak="0">
+  <w:abstractNum w:abstractNumId="40" w15:restartNumberingAfterBreak="0">
     <w:nsid w:val="7E7F1C51"/>
     <w:multiLevelType w:val="multilevel"/>
     <w:tmpl w:val="100C0021"/>
@@ -7786,97 +8217,97 @@
     </w:lvl>
   </w:abstractNum>
   <w:num w:numId="1" w16cid:durableId="975646661">
-    <w:abstractNumId w:val="11"/>
+    <w:abstractNumId w:val="12"/>
   </w:num>
   <w:num w:numId="2" w16cid:durableId="655842801">
-    <w:abstractNumId w:val="18"/>
+    <w:abstractNumId w:val="19"/>
   </w:num>
   <w:num w:numId="3" w16cid:durableId="1824809662">
-    <w:abstractNumId w:val="15"/>
+    <w:abstractNumId w:val="16"/>
   </w:num>
   <w:num w:numId="4" w16cid:durableId="2071223764">
-    <w:abstractNumId w:val="34"/>
+    <w:abstractNumId w:val="35"/>
   </w:num>
   <w:num w:numId="5" w16cid:durableId="21563355">
-    <w:abstractNumId w:val="34"/>
+    <w:abstractNumId w:val="35"/>
   </w:num>
   <w:num w:numId="6" w16cid:durableId="289871386">
-    <w:abstractNumId w:val="15"/>
+    <w:abstractNumId w:val="16"/>
   </w:num>
   <w:num w:numId="7" w16cid:durableId="2040427827">
-    <w:abstractNumId w:val="15"/>
+    <w:abstractNumId w:val="16"/>
   </w:num>
   <w:num w:numId="8" w16cid:durableId="600920665">
-    <w:abstractNumId w:val="15"/>
+    <w:abstractNumId w:val="16"/>
   </w:num>
   <w:num w:numId="9" w16cid:durableId="1339501055">
-    <w:abstractNumId w:val="15"/>
+    <w:abstractNumId w:val="16"/>
   </w:num>
   <w:num w:numId="10" w16cid:durableId="2038849588">
-    <w:abstractNumId w:val="34"/>
+    <w:abstractNumId w:val="35"/>
   </w:num>
   <w:num w:numId="11" w16cid:durableId="674114578">
-    <w:abstractNumId w:val="15"/>
+    <w:abstractNumId w:val="16"/>
   </w:num>
   <w:num w:numId="12" w16cid:durableId="1349261024">
+    <w:abstractNumId w:val="22"/>
+  </w:num>
+  <w:num w:numId="13" w16cid:durableId="1200237235">
     <w:abstractNumId w:val="21"/>
   </w:num>
-  <w:num w:numId="13" w16cid:durableId="1200237235">
+  <w:num w:numId="14" w16cid:durableId="573200217">
     <w:abstractNumId w:val="20"/>
   </w:num>
-  <w:num w:numId="14" w16cid:durableId="573200217">
-    <w:abstractNumId w:val="19"/>
-  </w:num>
   <w:num w:numId="15" w16cid:durableId="798648019">
-    <w:abstractNumId w:val="16"/>
+    <w:abstractNumId w:val="17"/>
   </w:num>
   <w:num w:numId="16" w16cid:durableId="2082632251">
-    <w:abstractNumId w:val="31"/>
+    <w:abstractNumId w:val="32"/>
   </w:num>
   <w:num w:numId="17" w16cid:durableId="2146894176">
-    <w:abstractNumId w:val="26"/>
+    <w:abstractNumId w:val="27"/>
   </w:num>
   <w:num w:numId="18" w16cid:durableId="1670476422">
-    <w:abstractNumId w:val="39"/>
+    <w:abstractNumId w:val="40"/>
   </w:num>
   <w:num w:numId="19" w16cid:durableId="1774085574">
-    <w:abstractNumId w:val="37"/>
+    <w:abstractNumId w:val="38"/>
   </w:num>
   <w:num w:numId="20" w16cid:durableId="1132482527">
     <w:abstractNumId w:val="10"/>
   </w:num>
   <w:num w:numId="21" w16cid:durableId="1928541929">
-    <w:abstractNumId w:val="35"/>
+    <w:abstractNumId w:val="36"/>
   </w:num>
   <w:num w:numId="22" w16cid:durableId="2057583399">
-    <w:abstractNumId w:val="25"/>
+    <w:abstractNumId w:val="26"/>
   </w:num>
   <w:num w:numId="23" w16cid:durableId="1955090194">
-    <w:abstractNumId w:val="23"/>
+    <w:abstractNumId w:val="24"/>
   </w:num>
   <w:num w:numId="24" w16cid:durableId="1708094444">
+    <w:abstractNumId w:val="14"/>
+  </w:num>
+  <w:num w:numId="25" w16cid:durableId="802383293">
+    <w:abstractNumId w:val="18"/>
+  </w:num>
+  <w:num w:numId="26" w16cid:durableId="1775200987">
     <w:abstractNumId w:val="13"/>
   </w:num>
-  <w:num w:numId="25" w16cid:durableId="802383293">
-    <w:abstractNumId w:val="17"/>
+  <w:num w:numId="27" w16cid:durableId="1419405076">
+    <w:abstractNumId w:val="31"/>
   </w:num>
-  <w:num w:numId="26" w16cid:durableId="1775200987">
-    <w:abstractNumId w:val="12"/>
+  <w:num w:numId="28" w16cid:durableId="1834293107">
+    <w:abstractNumId w:val="34"/>
   </w:num>
-  <w:num w:numId="27" w16cid:durableId="1419405076">
+  <w:num w:numId="29" w16cid:durableId="1106658217">
+    <w:abstractNumId w:val="29"/>
+  </w:num>
+  <w:num w:numId="30" w16cid:durableId="1913733430">
     <w:abstractNumId w:val="30"/>
   </w:num>
-  <w:num w:numId="28" w16cid:durableId="1834293107">
-    <w:abstractNumId w:val="33"/>
-  </w:num>
-  <w:num w:numId="29" w16cid:durableId="1106658217">
-    <w:abstractNumId w:val="28"/>
-  </w:num>
-  <w:num w:numId="30" w16cid:durableId="1913733430">
-    <w:abstractNumId w:val="29"/>
-  </w:num>
   <w:num w:numId="31" w16cid:durableId="683167554">
-    <w:abstractNumId w:val="36"/>
+    <w:abstractNumId w:val="37"/>
   </w:num>
   <w:num w:numId="32" w16cid:durableId="955259452">
     <w:abstractNumId w:val="8"/>
@@ -7909,22 +8340,25 @@
     <w:abstractNumId w:val="4"/>
   </w:num>
   <w:num w:numId="42" w16cid:durableId="556816648">
-    <w:abstractNumId w:val="27"/>
+    <w:abstractNumId w:val="28"/>
   </w:num>
   <w:num w:numId="43" w16cid:durableId="1242325609">
-    <w:abstractNumId w:val="24"/>
+    <w:abstractNumId w:val="25"/>
   </w:num>
   <w:num w:numId="44" w16cid:durableId="376517696">
-    <w:abstractNumId w:val="38"/>
+    <w:abstractNumId w:val="39"/>
   </w:num>
   <w:num w:numId="45" w16cid:durableId="534393247">
-    <w:abstractNumId w:val="14"/>
+    <w:abstractNumId w:val="15"/>
   </w:num>
   <w:num w:numId="46" w16cid:durableId="1253321437">
-    <w:abstractNumId w:val="22"/>
+    <w:abstractNumId w:val="23"/>
   </w:num>
   <w:num w:numId="47" w16cid:durableId="1578444669">
-    <w:abstractNumId w:val="32"/>
+    <w:abstractNumId w:val="33"/>
+  </w:num>
+  <w:num w:numId="48" w16cid:durableId="594217520">
+    <w:abstractNumId w:val="11"/>
   </w:num>
   <w:numIdMacAtCleanup w:val="4"/>
 </w:numbering>
@@ -8517,7 +8951,6 @@
   <w:style w:type="character" w:default="1" w:styleId="Policepardfaut">
     <w:name w:val="Default Paragraph Font"/>
     <w:uiPriority w:val="1"/>
-    <w:semiHidden/>
     <w:unhideWhenUsed/>
   </w:style>
   <w:style w:type="table" w:default="1" w:styleId="TableauNormal">

</xml_diff>

<commit_message>
feat : màj rapport
</commit_message>
<xml_diff>
--- a/docs/rapport/R-I323-KirilBormin.docx
+++ b/docs/rapport/R-I323-KirilBormin.docx
@@ -2073,6 +2073,7 @@
           <w:szCs w:val="32"/>
         </w:rPr>
       </w:pPr>
+      <w:proofErr w:type="spellStart"/>
       <w:r>
         <w:rPr>
           <w:rStyle w:val="lev"/>
@@ -2083,6 +2084,7 @@
         </w:rPr>
         <w:t>PlotThoseLines</w:t>
       </w:r>
+      <w:proofErr w:type="spellEnd"/>
     </w:p>
     <w:p>
       <w:pPr>
@@ -2105,7 +2107,15 @@
         <w:t xml:space="preserve"> (séries de données dans le temps)</w:t>
       </w:r>
       <w:r>
-        <w:t>. L’utilisateur peut utiliser 2 sources de données : json et csv</w:t>
+        <w:t xml:space="preserve">. L’utilisateur peut utiliser 2 sources de données : </w:t>
+      </w:r>
+      <w:proofErr w:type="spellStart"/>
+      <w:r>
+        <w:t>json</w:t>
+      </w:r>
+      <w:proofErr w:type="spellEnd"/>
+      <w:r>
+        <w:t xml:space="preserve"> et csv</w:t>
       </w:r>
       <w:r>
         <w:t>.</w:t>
@@ -2163,9 +2173,11 @@
           <w:numId w:val="48"/>
         </w:numPr>
       </w:pPr>
+      <w:proofErr w:type="spellStart"/>
       <w:r>
         <w:t>Nvidia</w:t>
       </w:r>
+      <w:proofErr w:type="spellEnd"/>
     </w:p>
     <w:p>
       <w:pPr>
@@ -2281,7 +2293,15 @@
         <w:t xml:space="preserve"> –</w:t>
       </w:r>
       <w:r>
-        <w:t xml:space="preserve"> Fichiers .csv ou json exporté depuis Yahoo Finance</w:t>
+        <w:t xml:space="preserve"> Fichiers .csv ou </w:t>
+      </w:r>
+      <w:proofErr w:type="spellStart"/>
+      <w:r>
+        <w:t>json</w:t>
+      </w:r>
+      <w:proofErr w:type="spellEnd"/>
+      <w:r>
+        <w:t xml:space="preserve"> exporté depuis Yahoo Finance</w:t>
       </w:r>
       <w:r>
         <w:t xml:space="preserve"> </w:t>
@@ -2670,42 +2690,93 @@
       <w:r>
         <w:t>En tant qu'utilisateur,</w:t>
       </w:r>
-    </w:p>
-    <w:p>
-      <w:r>
-        <w:t>Je veux pouvoir facilement et d'une manière simple ajouter ma serie de données dans le programme.</w:t>
-      </w:r>
-    </w:p>
-    <w:p>
-      <w:r>
-        <w:t>Afin de charger et stocker localement de nouvelles séries temporelles pour une utilisation hors ligne.</w:t>
+      <w:r>
+        <w:br/>
+        <w:t>Je veux importer un fichier de données local (.csv</w:t>
+      </w:r>
+      <w:proofErr w:type="gramStart"/>
+      <w:r>
+        <w:t>, .</w:t>
+      </w:r>
+      <w:proofErr w:type="spellStart"/>
+      <w:r>
+        <w:t>json</w:t>
+      </w:r>
+      <w:proofErr w:type="spellEnd"/>
+      <w:proofErr w:type="gramEnd"/>
+      <w:r>
+        <w:t>),</w:t>
+      </w:r>
+      <w:r>
+        <w:br/>
+        <w:t>Afin de charger et stocker de nouvelles séries temporelles pour une utilisation hors ligne.</w:t>
       </w:r>
     </w:p>
     <w:p/>
-    <w:p>
-      <w:r>
-        <w:t>•   Sur la page principale, dans le menu"Fichier" je vois l'option appelé</w:t>
-      </w:r>
-      <w:r>
-        <w:t>e</w:t>
-      </w:r>
-      <w:r>
-        <w:t xml:space="preserve"> "Importer un fichier")</w:t>
-      </w:r>
-    </w:p>
-    <w:p>
-      <w:r>
-        <w:t>•   En cliquant sur ce bouton, il y a une fenêtre d'explorateur de fichiers qui apparaît, avec le filtre sur les fichiers .csv .json</w:t>
-      </w:r>
-    </w:p>
-    <w:p>
-      <w:r>
-        <w:t xml:space="preserve">  -   Après l'ajout d'un fichier, la (les) série(s) est enregistrée dans le stockage local et devient disponible dans la liste des graphiques</w:t>
-      </w:r>
-    </w:p>
-    <w:p>
-      <w:r>
-        <w:t xml:space="preserve">  -   Si après avoir choisi le fichier, qui est corrompu ou introuvable, une fenêtre avec l'erreur s'affiche au centre.</w:t>
+    <w:p/>
+    <w:p>
+      <w:pPr>
+        <w:numPr>
+          <w:ilvl w:val="0"/>
+          <w:numId w:val="49"/>
+        </w:numPr>
+      </w:pPr>
+      <w:r>
+        <w:t>Accès : L'option est accessible depuis le menu Fichier &gt; Importer un fichier.</w:t>
+      </w:r>
+    </w:p>
+    <w:p>
+      <w:pPr>
+        <w:numPr>
+          <w:ilvl w:val="0"/>
+          <w:numId w:val="49"/>
+        </w:numPr>
+      </w:pPr>
+      <w:r>
+        <w:t xml:space="preserve">Sélection : Une boîte de dialogue d'exploration de fichiers s'ouvre avec un filtre prédéfini sur les extensions .csv </w:t>
+      </w:r>
+      <w:proofErr w:type="gramStart"/>
+      <w:r>
+        <w:t>et .</w:t>
+      </w:r>
+      <w:proofErr w:type="spellStart"/>
+      <w:r>
+        <w:t>json</w:t>
+      </w:r>
+      <w:proofErr w:type="spellEnd"/>
+      <w:proofErr w:type="gramEnd"/>
+      <w:r>
+        <w:t xml:space="preserve">. </w:t>
+      </w:r>
+    </w:p>
+    <w:p>
+      <w:pPr>
+        <w:numPr>
+          <w:ilvl w:val="0"/>
+          <w:numId w:val="50"/>
+        </w:numPr>
+      </w:pPr>
+      <w:r>
+        <w:t xml:space="preserve">Succès : Le fichier est lu et les données sont enregistrées dans le stockage local -&gt; La nouvelle série s'ajoute automatiquement à la liste des graphiques </w:t>
+      </w:r>
+      <w:proofErr w:type="spellStart"/>
+      <w:r>
+        <w:t>cochables</w:t>
+      </w:r>
+      <w:proofErr w:type="spellEnd"/>
+      <w:r>
+        <w:t xml:space="preserve"> à gauche.</w:t>
+      </w:r>
+    </w:p>
+    <w:p>
+      <w:pPr>
+        <w:numPr>
+          <w:ilvl w:val="0"/>
+          <w:numId w:val="50"/>
+        </w:numPr>
+      </w:pPr>
+      <w:r>
+        <w:t>Cas d'erreur : Si le fichier est corrompu, vide ou mal structuré, l'application ne plante pas - &gt; une boîte de dialogue s'affiche au centre avec un message explicite.</w:t>
       </w:r>
     </w:p>
     <w:p/>
@@ -2772,7 +2843,15 @@
     </w:p>
     <w:p>
       <w:r>
-        <w:t>Je veux pouvoir masquer une serie de la vue active,</w:t>
+        <w:t xml:space="preserve">Je veux pouvoir masquer une </w:t>
+      </w:r>
+      <w:proofErr w:type="spellStart"/>
+      <w:r>
+        <w:t>serie</w:t>
+      </w:r>
+      <w:proofErr w:type="spellEnd"/>
+      <w:r>
+        <w:t xml:space="preserve"> de la vue active,</w:t>
       </w:r>
     </w:p>
     <w:p>
@@ -2783,7 +2862,15 @@
     <w:p/>
     <w:p>
       <w:r>
-        <w:t>•   Une liste cochable de suppression retire une courbe du graphique immédiatement.</w:t>
+        <w:t xml:space="preserve">•   Une liste </w:t>
+      </w:r>
+      <w:proofErr w:type="spellStart"/>
+      <w:r>
+        <w:t>cochable</w:t>
+      </w:r>
+      <w:proofErr w:type="spellEnd"/>
+      <w:r>
+        <w:t xml:space="preserve"> de suppression retire une courbe du graphique immédiatement.</w:t>
       </w:r>
     </w:p>
     <w:p/>
@@ -2959,7 +3046,15 @@
     </w:p>
     <w:p>
       <w:r>
-        <w:t>•   Afficher ou masquer une série -&gt;  La légende actualise instantanément le nom et la pastille de couleur correspondante.</w:t>
+        <w:t>•   Afficher ou masquer une série -</w:t>
+      </w:r>
+      <w:proofErr w:type="gramStart"/>
+      <w:r>
+        <w:t>&gt;  La</w:t>
+      </w:r>
+      <w:proofErr w:type="gramEnd"/>
+      <w:r>
+        <w:t xml:space="preserve"> légende actualise instantanément le nom et la pastille de couleur correspondante.</w:t>
       </w:r>
     </w:p>
     <w:p/>
@@ -3424,9 +3519,14 @@
       <w:bookmarkStart w:id="16" w:name="_Toc165969652"/>
       <w:bookmarkStart w:id="17" w:name="_Ref308525868"/>
       <w:r>
-        <w:t>Points techniques évalués du CdC</w:t>
+        <w:t xml:space="preserve">Points techniques évalués du </w:t>
+      </w:r>
+      <w:proofErr w:type="spellStart"/>
+      <w:r>
+        <w:t>CdC</w:t>
       </w:r>
       <w:bookmarkEnd w:id="14"/>
+      <w:proofErr w:type="spellEnd"/>
     </w:p>
     <w:p>
       <w:pPr>
@@ -3437,8 +3537,13 @@
         </w:numPr>
       </w:pPr>
       <w:r>
-        <w:t>Copier du CdC</w:t>
-      </w:r>
+        <w:t xml:space="preserve">Copier du </w:t>
+      </w:r>
+      <w:proofErr w:type="spellStart"/>
+      <w:r>
+        <w:t>CdC</w:t>
+      </w:r>
+      <w:proofErr w:type="spellEnd"/>
     </w:p>
     <w:p>
       <w:pPr>
@@ -3608,7 +3713,15 @@
         </w:numPr>
       </w:pPr>
       <w:r>
-        <w:t>Capture de la planif finale</w:t>
+        <w:t xml:space="preserve">Capture de la </w:t>
+      </w:r>
+      <w:proofErr w:type="spellStart"/>
+      <w:r>
+        <w:t>planif</w:t>
+      </w:r>
+      <w:proofErr w:type="spellEnd"/>
+      <w:r>
+        <w:t xml:space="preserve"> finale</w:t>
       </w:r>
     </w:p>
     <w:p>
@@ -3646,8 +3759,13 @@
         </w:numPr>
       </w:pPr>
       <w:r>
-        <w:t>Si c’était à refaire:</w:t>
-      </w:r>
+        <w:t xml:space="preserve">Si c’était à </w:t>
+      </w:r>
+      <w:proofErr w:type="gramStart"/>
+      <w:r>
+        <w:t>refaire:</w:t>
+      </w:r>
+      <w:proofErr w:type="gramEnd"/>
     </w:p>
     <w:p>
       <w:pPr>
@@ -3693,8 +3811,13 @@
           <w:numId w:val="24"/>
         </w:numPr>
       </w:pPr>
-      <w:r>
-        <w:t>Suite à donner, améliorations souhaitables, …</w:t>
+      <w:proofErr w:type="gramStart"/>
+      <w:r>
+        <w:t>Suite à</w:t>
+      </w:r>
+      <w:proofErr w:type="gramEnd"/>
+      <w:r>
+        <w:t xml:space="preserve"> donner, améliorations souhaitables, …</w:t>
       </w:r>
     </w:p>
     <w:p>
@@ -3731,8 +3854,13 @@
         </w:numPr>
       </w:pPr>
       <w:r>
-        <w:t>Si c’était à refaire:</w:t>
-      </w:r>
+        <w:t xml:space="preserve">Si c’était à </w:t>
+      </w:r>
+      <w:proofErr w:type="gramStart"/>
+      <w:r>
+        <w:t>refaire:</w:t>
+      </w:r>
+      <w:proofErr w:type="gramEnd"/>
     </w:p>
     <w:p>
       <w:pPr>
@@ -3778,8 +3906,13 @@
           <w:numId w:val="24"/>
         </w:numPr>
       </w:pPr>
-      <w:r>
-        <w:t>Suite à donner, améliorations souhaitables, …</w:t>
+      <w:proofErr w:type="gramStart"/>
+      <w:r>
+        <w:t>Suite à</w:t>
+      </w:r>
+      <w:proofErr w:type="gramEnd"/>
+      <w:r>
+        <w:t xml:space="preserve"> donner, améliorations souhaitables, …</w:t>
       </w:r>
     </w:p>
     <w:p>
@@ -3817,11 +3950,16 @@
         </w:numPr>
       </w:pPr>
       <w:r>
-        <w:t>Si c’était à refaire</w:t>
+        <w:t xml:space="preserve">Si c’était à </w:t>
+      </w:r>
+      <w:proofErr w:type="gramStart"/>
+      <w:r>
+        <w:t>refaire</w:t>
       </w:r>
       <w:r>
         <w:t>:</w:t>
       </w:r>
+      <w:proofErr w:type="gramEnd"/>
     </w:p>
     <w:p>
       <w:pPr>
@@ -3888,8 +4026,13 @@
           <w:numId w:val="24"/>
         </w:numPr>
       </w:pPr>
-      <w:r>
-        <w:t>Suite à donner, améliorations souhaitables, …</w:t>
+      <w:proofErr w:type="gramStart"/>
+      <w:r>
+        <w:t>Suite à</w:t>
+      </w:r>
+      <w:proofErr w:type="gramEnd"/>
+      <w:r>
+        <w:t xml:space="preserve"> donner, améliorations souhaitables, …</w:t>
       </w:r>
     </w:p>
     <w:p>
@@ -4366,12 +4509,21 @@
               <w:szCs w:val="16"/>
             </w:rPr>
           </w:pPr>
+          <w:proofErr w:type="gramStart"/>
           <w:r>
             <w:rPr>
               <w:rFonts w:cs="Arial"/>
               <w:szCs w:val="16"/>
             </w:rPr>
-            <w:t xml:space="preserve">Version: </w:t>
+            <w:t>Version:</w:t>
+          </w:r>
+          <w:proofErr w:type="gramEnd"/>
+          <w:r>
+            <w:rPr>
+              <w:rFonts w:cs="Arial"/>
+              <w:szCs w:val="16"/>
+            </w:rPr>
+            <w:t xml:space="preserve"> </w:t>
           </w:r>
           <w:fldSimple w:instr=" REVNUM   \* MERGEFORMAT ">
             <w:r>
@@ -6940,6 +7092,155 @@
     </w:lvl>
   </w:abstractNum>
   <w:abstractNum w:abstractNumId="29" w15:restartNumberingAfterBreak="0">
+    <w:nsid w:val="4CD25194"/>
+    <w:multiLevelType w:val="multilevel"/>
+    <w:tmpl w:val="B984A708"/>
+    <w:lvl w:ilvl="0">
+      <w:start w:val="1"/>
+      <w:numFmt w:val="bullet"/>
+      <w:lvlText w:val=""/>
+      <w:lvlJc w:val="left"/>
+      <w:pPr>
+        <w:tabs>
+          <w:tab w:val="num" w:pos="720"/>
+        </w:tabs>
+        <w:ind w:left="720" w:hanging="360"/>
+      </w:pPr>
+      <w:rPr>
+        <w:rFonts w:ascii="Symbol" w:hAnsi="Symbol" w:hint="default"/>
+        <w:sz w:val="20"/>
+      </w:rPr>
+    </w:lvl>
+    <w:lvl w:ilvl="1" w:tentative="1">
+      <w:start w:val="1"/>
+      <w:numFmt w:val="bullet"/>
+      <w:lvlText w:val="o"/>
+      <w:lvlJc w:val="left"/>
+      <w:pPr>
+        <w:tabs>
+          <w:tab w:val="num" w:pos="1440"/>
+        </w:tabs>
+        <w:ind w:left="1440" w:hanging="360"/>
+      </w:pPr>
+      <w:rPr>
+        <w:rFonts w:ascii="Courier New" w:hAnsi="Courier New" w:hint="default"/>
+        <w:sz w:val="20"/>
+      </w:rPr>
+    </w:lvl>
+    <w:lvl w:ilvl="2" w:tentative="1">
+      <w:start w:val="1"/>
+      <w:numFmt w:val="bullet"/>
+      <w:lvlText w:val=""/>
+      <w:lvlJc w:val="left"/>
+      <w:pPr>
+        <w:tabs>
+          <w:tab w:val="num" w:pos="2160"/>
+        </w:tabs>
+        <w:ind w:left="2160" w:hanging="360"/>
+      </w:pPr>
+      <w:rPr>
+        <w:rFonts w:ascii="Wingdings" w:hAnsi="Wingdings" w:hint="default"/>
+        <w:sz w:val="20"/>
+      </w:rPr>
+    </w:lvl>
+    <w:lvl w:ilvl="3" w:tentative="1">
+      <w:start w:val="1"/>
+      <w:numFmt w:val="bullet"/>
+      <w:lvlText w:val=""/>
+      <w:lvlJc w:val="left"/>
+      <w:pPr>
+        <w:tabs>
+          <w:tab w:val="num" w:pos="2880"/>
+        </w:tabs>
+        <w:ind w:left="2880" w:hanging="360"/>
+      </w:pPr>
+      <w:rPr>
+        <w:rFonts w:ascii="Wingdings" w:hAnsi="Wingdings" w:hint="default"/>
+        <w:sz w:val="20"/>
+      </w:rPr>
+    </w:lvl>
+    <w:lvl w:ilvl="4" w:tentative="1">
+      <w:start w:val="1"/>
+      <w:numFmt w:val="bullet"/>
+      <w:lvlText w:val=""/>
+      <w:lvlJc w:val="left"/>
+      <w:pPr>
+        <w:tabs>
+          <w:tab w:val="num" w:pos="3600"/>
+        </w:tabs>
+        <w:ind w:left="3600" w:hanging="360"/>
+      </w:pPr>
+      <w:rPr>
+        <w:rFonts w:ascii="Wingdings" w:hAnsi="Wingdings" w:hint="default"/>
+        <w:sz w:val="20"/>
+      </w:rPr>
+    </w:lvl>
+    <w:lvl w:ilvl="5" w:tentative="1">
+      <w:start w:val="1"/>
+      <w:numFmt w:val="bullet"/>
+      <w:lvlText w:val=""/>
+      <w:lvlJc w:val="left"/>
+      <w:pPr>
+        <w:tabs>
+          <w:tab w:val="num" w:pos="4320"/>
+        </w:tabs>
+        <w:ind w:left="4320" w:hanging="360"/>
+      </w:pPr>
+      <w:rPr>
+        <w:rFonts w:ascii="Wingdings" w:hAnsi="Wingdings" w:hint="default"/>
+        <w:sz w:val="20"/>
+      </w:rPr>
+    </w:lvl>
+    <w:lvl w:ilvl="6" w:tentative="1">
+      <w:start w:val="1"/>
+      <w:numFmt w:val="bullet"/>
+      <w:lvlText w:val=""/>
+      <w:lvlJc w:val="left"/>
+      <w:pPr>
+        <w:tabs>
+          <w:tab w:val="num" w:pos="5040"/>
+        </w:tabs>
+        <w:ind w:left="5040" w:hanging="360"/>
+      </w:pPr>
+      <w:rPr>
+        <w:rFonts w:ascii="Wingdings" w:hAnsi="Wingdings" w:hint="default"/>
+        <w:sz w:val="20"/>
+      </w:rPr>
+    </w:lvl>
+    <w:lvl w:ilvl="7" w:tentative="1">
+      <w:start w:val="1"/>
+      <w:numFmt w:val="bullet"/>
+      <w:lvlText w:val=""/>
+      <w:lvlJc w:val="left"/>
+      <w:pPr>
+        <w:tabs>
+          <w:tab w:val="num" w:pos="5760"/>
+        </w:tabs>
+        <w:ind w:left="5760" w:hanging="360"/>
+      </w:pPr>
+      <w:rPr>
+        <w:rFonts w:ascii="Wingdings" w:hAnsi="Wingdings" w:hint="default"/>
+        <w:sz w:val="20"/>
+      </w:rPr>
+    </w:lvl>
+    <w:lvl w:ilvl="8" w:tentative="1">
+      <w:start w:val="1"/>
+      <w:numFmt w:val="bullet"/>
+      <w:lvlText w:val=""/>
+      <w:lvlJc w:val="left"/>
+      <w:pPr>
+        <w:tabs>
+          <w:tab w:val="num" w:pos="6480"/>
+        </w:tabs>
+        <w:ind w:left="6480" w:hanging="360"/>
+      </w:pPr>
+      <w:rPr>
+        <w:rFonts w:ascii="Wingdings" w:hAnsi="Wingdings" w:hint="default"/>
+        <w:sz w:val="20"/>
+      </w:rPr>
+    </w:lvl>
+  </w:abstractNum>
+  <w:abstractNum w:abstractNumId="30" w15:restartNumberingAfterBreak="0">
     <w:nsid w:val="4D30734E"/>
     <w:multiLevelType w:val="multilevel"/>
     <w:tmpl w:val="100C001D"/>
@@ -7025,7 +7326,7 @@
       </w:pPr>
     </w:lvl>
   </w:abstractNum>
-  <w:abstractNum w:abstractNumId="30" w15:restartNumberingAfterBreak="0">
+  <w:abstractNum w:abstractNumId="31" w15:restartNumberingAfterBreak="0">
     <w:nsid w:val="55FE2729"/>
     <w:multiLevelType w:val="multilevel"/>
     <w:tmpl w:val="100C0023"/>
@@ -7112,7 +7413,7 @@
       </w:pPr>
     </w:lvl>
   </w:abstractNum>
-  <w:abstractNum w:abstractNumId="31" w15:restartNumberingAfterBreak="0">
+  <w:abstractNum w:abstractNumId="32" w15:restartNumberingAfterBreak="0">
     <w:nsid w:val="58933B2A"/>
     <w:multiLevelType w:val="multilevel"/>
     <w:tmpl w:val="100C0021"/>
@@ -7225,7 +7526,7 @@
       </w:rPr>
     </w:lvl>
   </w:abstractNum>
-  <w:abstractNum w:abstractNumId="32" w15:restartNumberingAfterBreak="0">
+  <w:abstractNum w:abstractNumId="33" w15:restartNumberingAfterBreak="0">
     <w:nsid w:val="5C877673"/>
     <w:multiLevelType w:val="multilevel"/>
     <w:tmpl w:val="100C0021"/>
@@ -7338,7 +7639,7 @@
       </w:rPr>
     </w:lvl>
   </w:abstractNum>
-  <w:abstractNum w:abstractNumId="33" w15:restartNumberingAfterBreak="0">
+  <w:abstractNum w:abstractNumId="34" w15:restartNumberingAfterBreak="0">
     <w:nsid w:val="5CBC53EC"/>
     <w:multiLevelType w:val="multilevel"/>
     <w:tmpl w:val="2F6EF210"/>
@@ -7451,7 +7752,7 @@
       </w:rPr>
     </w:lvl>
   </w:abstractNum>
-  <w:abstractNum w:abstractNumId="34" w15:restartNumberingAfterBreak="0">
+  <w:abstractNum w:abstractNumId="35" w15:restartNumberingAfterBreak="0">
     <w:nsid w:val="5E424682"/>
     <w:multiLevelType w:val="multilevel"/>
     <w:tmpl w:val="100C001F"/>
@@ -7537,7 +7838,156 @@
       </w:pPr>
     </w:lvl>
   </w:abstractNum>
-  <w:abstractNum w:abstractNumId="35" w15:restartNumberingAfterBreak="0">
+  <w:abstractNum w:abstractNumId="36" w15:restartNumberingAfterBreak="0">
+    <w:nsid w:val="63073E62"/>
+    <w:multiLevelType w:val="multilevel"/>
+    <w:tmpl w:val="CBF072D6"/>
+    <w:lvl w:ilvl="0">
+      <w:start w:val="1"/>
+      <w:numFmt w:val="bullet"/>
+      <w:lvlText w:val=""/>
+      <w:lvlJc w:val="left"/>
+      <w:pPr>
+        <w:tabs>
+          <w:tab w:val="num" w:pos="720"/>
+        </w:tabs>
+        <w:ind w:left="720" w:hanging="360"/>
+      </w:pPr>
+      <w:rPr>
+        <w:rFonts w:ascii="Symbol" w:hAnsi="Symbol" w:hint="default"/>
+        <w:sz w:val="20"/>
+      </w:rPr>
+    </w:lvl>
+    <w:lvl w:ilvl="1" w:tentative="1">
+      <w:start w:val="1"/>
+      <w:numFmt w:val="bullet"/>
+      <w:lvlText w:val="o"/>
+      <w:lvlJc w:val="left"/>
+      <w:pPr>
+        <w:tabs>
+          <w:tab w:val="num" w:pos="1440"/>
+        </w:tabs>
+        <w:ind w:left="1440" w:hanging="360"/>
+      </w:pPr>
+      <w:rPr>
+        <w:rFonts w:ascii="Courier New" w:hAnsi="Courier New" w:hint="default"/>
+        <w:sz w:val="20"/>
+      </w:rPr>
+    </w:lvl>
+    <w:lvl w:ilvl="2" w:tentative="1">
+      <w:start w:val="1"/>
+      <w:numFmt w:val="bullet"/>
+      <w:lvlText w:val=""/>
+      <w:lvlJc w:val="left"/>
+      <w:pPr>
+        <w:tabs>
+          <w:tab w:val="num" w:pos="2160"/>
+        </w:tabs>
+        <w:ind w:left="2160" w:hanging="360"/>
+      </w:pPr>
+      <w:rPr>
+        <w:rFonts w:ascii="Wingdings" w:hAnsi="Wingdings" w:hint="default"/>
+        <w:sz w:val="20"/>
+      </w:rPr>
+    </w:lvl>
+    <w:lvl w:ilvl="3" w:tentative="1">
+      <w:start w:val="1"/>
+      <w:numFmt w:val="bullet"/>
+      <w:lvlText w:val=""/>
+      <w:lvlJc w:val="left"/>
+      <w:pPr>
+        <w:tabs>
+          <w:tab w:val="num" w:pos="2880"/>
+        </w:tabs>
+        <w:ind w:left="2880" w:hanging="360"/>
+      </w:pPr>
+      <w:rPr>
+        <w:rFonts w:ascii="Wingdings" w:hAnsi="Wingdings" w:hint="default"/>
+        <w:sz w:val="20"/>
+      </w:rPr>
+    </w:lvl>
+    <w:lvl w:ilvl="4" w:tentative="1">
+      <w:start w:val="1"/>
+      <w:numFmt w:val="bullet"/>
+      <w:lvlText w:val=""/>
+      <w:lvlJc w:val="left"/>
+      <w:pPr>
+        <w:tabs>
+          <w:tab w:val="num" w:pos="3600"/>
+        </w:tabs>
+        <w:ind w:left="3600" w:hanging="360"/>
+      </w:pPr>
+      <w:rPr>
+        <w:rFonts w:ascii="Wingdings" w:hAnsi="Wingdings" w:hint="default"/>
+        <w:sz w:val="20"/>
+      </w:rPr>
+    </w:lvl>
+    <w:lvl w:ilvl="5" w:tentative="1">
+      <w:start w:val="1"/>
+      <w:numFmt w:val="bullet"/>
+      <w:lvlText w:val=""/>
+      <w:lvlJc w:val="left"/>
+      <w:pPr>
+        <w:tabs>
+          <w:tab w:val="num" w:pos="4320"/>
+        </w:tabs>
+        <w:ind w:left="4320" w:hanging="360"/>
+      </w:pPr>
+      <w:rPr>
+        <w:rFonts w:ascii="Wingdings" w:hAnsi="Wingdings" w:hint="default"/>
+        <w:sz w:val="20"/>
+      </w:rPr>
+    </w:lvl>
+    <w:lvl w:ilvl="6" w:tentative="1">
+      <w:start w:val="1"/>
+      <w:numFmt w:val="bullet"/>
+      <w:lvlText w:val=""/>
+      <w:lvlJc w:val="left"/>
+      <w:pPr>
+        <w:tabs>
+          <w:tab w:val="num" w:pos="5040"/>
+        </w:tabs>
+        <w:ind w:left="5040" w:hanging="360"/>
+      </w:pPr>
+      <w:rPr>
+        <w:rFonts w:ascii="Wingdings" w:hAnsi="Wingdings" w:hint="default"/>
+        <w:sz w:val="20"/>
+      </w:rPr>
+    </w:lvl>
+    <w:lvl w:ilvl="7" w:tentative="1">
+      <w:start w:val="1"/>
+      <w:numFmt w:val="bullet"/>
+      <w:lvlText w:val=""/>
+      <w:lvlJc w:val="left"/>
+      <w:pPr>
+        <w:tabs>
+          <w:tab w:val="num" w:pos="5760"/>
+        </w:tabs>
+        <w:ind w:left="5760" w:hanging="360"/>
+      </w:pPr>
+      <w:rPr>
+        <w:rFonts w:ascii="Wingdings" w:hAnsi="Wingdings" w:hint="default"/>
+        <w:sz w:val="20"/>
+      </w:rPr>
+    </w:lvl>
+    <w:lvl w:ilvl="8" w:tentative="1">
+      <w:start w:val="1"/>
+      <w:numFmt w:val="bullet"/>
+      <w:lvlText w:val=""/>
+      <w:lvlJc w:val="left"/>
+      <w:pPr>
+        <w:tabs>
+          <w:tab w:val="num" w:pos="6480"/>
+        </w:tabs>
+        <w:ind w:left="6480" w:hanging="360"/>
+      </w:pPr>
+      <w:rPr>
+        <w:rFonts w:ascii="Wingdings" w:hAnsi="Wingdings" w:hint="default"/>
+        <w:sz w:val="20"/>
+      </w:rPr>
+    </w:lvl>
+  </w:abstractNum>
+  <w:abstractNum w:abstractNumId="37" w15:restartNumberingAfterBreak="0">
     <w:nsid w:val="63A9062F"/>
     <w:multiLevelType w:val="multilevel"/>
     <w:tmpl w:val="DCCE794A"/>
@@ -7677,7 +8127,7 @@
       </w:rPr>
     </w:lvl>
   </w:abstractNum>
-  <w:abstractNum w:abstractNumId="36" w15:restartNumberingAfterBreak="0">
+  <w:abstractNum w:abstractNumId="38" w15:restartNumberingAfterBreak="0">
     <w:nsid w:val="643F0961"/>
     <w:multiLevelType w:val="multilevel"/>
     <w:tmpl w:val="100C0021"/>
@@ -7790,7 +8240,7 @@
       </w:rPr>
     </w:lvl>
   </w:abstractNum>
-  <w:abstractNum w:abstractNumId="37" w15:restartNumberingAfterBreak="0">
+  <w:abstractNum w:abstractNumId="39" w15:restartNumberingAfterBreak="0">
     <w:nsid w:val="6D6476B9"/>
     <w:multiLevelType w:val="multilevel"/>
     <w:tmpl w:val="100C0023"/>
@@ -7877,7 +8327,7 @@
       </w:pPr>
     </w:lvl>
   </w:abstractNum>
-  <w:abstractNum w:abstractNumId="38" w15:restartNumberingAfterBreak="0">
+  <w:abstractNum w:abstractNumId="40" w15:restartNumberingAfterBreak="0">
     <w:nsid w:val="70C03573"/>
     <w:multiLevelType w:val="multilevel"/>
     <w:tmpl w:val="100C0021"/>
@@ -7990,7 +8440,7 @@
       </w:rPr>
     </w:lvl>
   </w:abstractNum>
-  <w:abstractNum w:abstractNumId="39" w15:restartNumberingAfterBreak="0">
+  <w:abstractNum w:abstractNumId="41" w15:restartNumberingAfterBreak="0">
     <w:nsid w:val="79CD09A9"/>
     <w:multiLevelType w:val="multilevel"/>
     <w:tmpl w:val="100C0021"/>
@@ -8103,7 +8553,7 @@
       </w:rPr>
     </w:lvl>
   </w:abstractNum>
-  <w:abstractNum w:abstractNumId="40" w15:restartNumberingAfterBreak="0">
+  <w:abstractNum w:abstractNumId="42" w15:restartNumberingAfterBreak="0">
     <w:nsid w:val="7E7F1C51"/>
     <w:multiLevelType w:val="multilevel"/>
     <w:tmpl w:val="100C0021"/>
@@ -8226,10 +8676,10 @@
     <w:abstractNumId w:val="16"/>
   </w:num>
   <w:num w:numId="4" w16cid:durableId="2071223764">
-    <w:abstractNumId w:val="35"/>
+    <w:abstractNumId w:val="37"/>
   </w:num>
   <w:num w:numId="5" w16cid:durableId="21563355">
-    <w:abstractNumId w:val="35"/>
+    <w:abstractNumId w:val="37"/>
   </w:num>
   <w:num w:numId="6" w16cid:durableId="289871386">
     <w:abstractNumId w:val="16"/>
@@ -8244,7 +8694,7 @@
     <w:abstractNumId w:val="16"/>
   </w:num>
   <w:num w:numId="10" w16cid:durableId="2038849588">
-    <w:abstractNumId w:val="35"/>
+    <w:abstractNumId w:val="37"/>
   </w:num>
   <w:num w:numId="11" w16cid:durableId="674114578">
     <w:abstractNumId w:val="16"/>
@@ -8262,22 +8712,22 @@
     <w:abstractNumId w:val="17"/>
   </w:num>
   <w:num w:numId="16" w16cid:durableId="2082632251">
-    <w:abstractNumId w:val="32"/>
+    <w:abstractNumId w:val="33"/>
   </w:num>
   <w:num w:numId="17" w16cid:durableId="2146894176">
     <w:abstractNumId w:val="27"/>
   </w:num>
   <w:num w:numId="18" w16cid:durableId="1670476422">
-    <w:abstractNumId w:val="40"/>
+    <w:abstractNumId w:val="42"/>
   </w:num>
   <w:num w:numId="19" w16cid:durableId="1774085574">
-    <w:abstractNumId w:val="38"/>
+    <w:abstractNumId w:val="40"/>
   </w:num>
   <w:num w:numId="20" w16cid:durableId="1132482527">
     <w:abstractNumId w:val="10"/>
   </w:num>
   <w:num w:numId="21" w16cid:durableId="1928541929">
-    <w:abstractNumId w:val="36"/>
+    <w:abstractNumId w:val="38"/>
   </w:num>
   <w:num w:numId="22" w16cid:durableId="2057583399">
     <w:abstractNumId w:val="26"/>
@@ -8295,19 +8745,19 @@
     <w:abstractNumId w:val="13"/>
   </w:num>
   <w:num w:numId="27" w16cid:durableId="1419405076">
+    <w:abstractNumId w:val="32"/>
+  </w:num>
+  <w:num w:numId="28" w16cid:durableId="1834293107">
+    <w:abstractNumId w:val="35"/>
+  </w:num>
+  <w:num w:numId="29" w16cid:durableId="1106658217">
+    <w:abstractNumId w:val="30"/>
+  </w:num>
+  <w:num w:numId="30" w16cid:durableId="1913733430">
     <w:abstractNumId w:val="31"/>
   </w:num>
-  <w:num w:numId="28" w16cid:durableId="1834293107">
-    <w:abstractNumId w:val="34"/>
-  </w:num>
-  <w:num w:numId="29" w16cid:durableId="1106658217">
-    <w:abstractNumId w:val="29"/>
-  </w:num>
-  <w:num w:numId="30" w16cid:durableId="1913733430">
-    <w:abstractNumId w:val="30"/>
-  </w:num>
   <w:num w:numId="31" w16cid:durableId="683167554">
-    <w:abstractNumId w:val="37"/>
+    <w:abstractNumId w:val="39"/>
   </w:num>
   <w:num w:numId="32" w16cid:durableId="955259452">
     <w:abstractNumId w:val="8"/>
@@ -8346,7 +8796,7 @@
     <w:abstractNumId w:val="25"/>
   </w:num>
   <w:num w:numId="44" w16cid:durableId="376517696">
-    <w:abstractNumId w:val="39"/>
+    <w:abstractNumId w:val="41"/>
   </w:num>
   <w:num w:numId="45" w16cid:durableId="534393247">
     <w:abstractNumId w:val="15"/>
@@ -8355,10 +8805,16 @@
     <w:abstractNumId w:val="23"/>
   </w:num>
   <w:num w:numId="47" w16cid:durableId="1578444669">
-    <w:abstractNumId w:val="33"/>
+    <w:abstractNumId w:val="34"/>
   </w:num>
   <w:num w:numId="48" w16cid:durableId="594217520">
     <w:abstractNumId w:val="11"/>
+  </w:num>
+  <w:num w:numId="49" w16cid:durableId="928197023">
+    <w:abstractNumId w:val="29"/>
+  </w:num>
+  <w:num w:numId="50" w16cid:durableId="1945337446">
+    <w:abstractNumId w:val="36"/>
   </w:num>
   <w:numIdMacAtCleanup w:val="4"/>
 </w:numbering>

</xml_diff>

<commit_message>
docs : màj jdt et rapport
</commit_message>
<xml_diff>
--- a/docs/rapport/R-I323-KirilBormin.docx
+++ b/docs/rapport/R-I323-KirilBormin.docx
@@ -2367,7 +2367,13 @@
         <w:t xml:space="preserve"> librairie</w:t>
       </w:r>
       <w:r>
-        <w:t>s en C#, améliorer la gestion d’un projet avec un planning précis.</w:t>
+        <w:t xml:space="preserve">s en C#, améliorer la gestion d’un projet avec </w:t>
+      </w:r>
+      <w:r>
+        <w:t>la méthodologie agile</w:t>
+      </w:r>
+      <w:r>
+        <w:t>.</w:t>
       </w:r>
       <w:r>
         <w:t xml:space="preserve">  </w:t>
@@ -2448,10 +2454,7 @@
               <w:ind w:left="0"/>
             </w:pPr>
             <w:r>
-              <w:t>Semaine</w:t>
-            </w:r>
-            <w:r>
-              <w:t xml:space="preserve"> 3</w:t>
+              <w:t>Semaine 3</w:t>
             </w:r>
           </w:p>
         </w:tc>
@@ -2481,10 +2484,7 @@
               <w:ind w:left="0"/>
             </w:pPr>
             <w:r>
-              <w:t xml:space="preserve">Semaine </w:t>
-            </w:r>
-            <w:r>
-              <w:t>4</w:t>
+              <w:t>Semaine 4</w:t>
             </w:r>
           </w:p>
         </w:tc>
@@ -2514,10 +2514,7 @@
               <w:ind w:left="0"/>
             </w:pPr>
             <w:r>
-              <w:t xml:space="preserve">Semaine </w:t>
-            </w:r>
-            <w:r>
-              <w:t>5</w:t>
+              <w:t>Semaine 5</w:t>
             </w:r>
           </w:p>
         </w:tc>
@@ -2547,10 +2544,7 @@
               <w:ind w:left="0"/>
             </w:pPr>
             <w:r>
-              <w:t xml:space="preserve">Semaine </w:t>
-            </w:r>
-            <w:r>
-              <w:t>6</w:t>
+              <w:t>Semaine 6</w:t>
             </w:r>
           </w:p>
         </w:tc>
@@ -2564,25 +2558,7 @@
               <w:ind w:left="0"/>
             </w:pPr>
             <w:r>
-              <w:t>Ajout de</w:t>
-            </w:r>
-            <w:r>
-              <w:t xml:space="preserve"> fonctionnalité quand</w:t>
-            </w:r>
-            <w:r>
-              <w:t xml:space="preserve"> plusieurs graphiques </w:t>
-            </w:r>
-            <w:r>
-              <w:t xml:space="preserve">sont </w:t>
-            </w:r>
-            <w:r>
-              <w:t>affiché</w:t>
-            </w:r>
-            <w:r>
-              <w:t>s</w:t>
-            </w:r>
-            <w:r>
-              <w:t xml:space="preserve"> simultanément, ajout de légende</w:t>
+              <w:t>Ajout de fonctionnalité quand plusieurs graphiques sont affichés simultanément, ajout de légende</w:t>
             </w:r>
           </w:p>
         </w:tc>
@@ -2692,18 +2668,13 @@
       </w:r>
       <w:r>
         <w:br/>
-        <w:t>Je veux importer un fichier de données local (.csv</w:t>
-      </w:r>
-      <w:proofErr w:type="gramStart"/>
-      <w:r>
-        <w:t>, .</w:t>
+        <w:t>Je veux importer un fichier de données local (.csv, .</w:t>
       </w:r>
       <w:proofErr w:type="spellStart"/>
       <w:r>
         <w:t>json</w:t>
       </w:r>
       <w:proofErr w:type="spellEnd"/>
-      <w:proofErr w:type="gramEnd"/>
       <w:r>
         <w:t>),</w:t>
       </w:r>
@@ -2733,18 +2704,13 @@
         </w:numPr>
       </w:pPr>
       <w:r>
-        <w:t xml:space="preserve">Sélection : Une boîte de dialogue d'exploration de fichiers s'ouvre avec un filtre prédéfini sur les extensions .csv </w:t>
-      </w:r>
-      <w:proofErr w:type="gramStart"/>
-      <w:r>
-        <w:t>et .</w:t>
+        <w:t>Sélection : Une boîte de dialogue d'exploration de fichiers s'ouvre avec un filtre prédéfini sur les extensions .csv et .</w:t>
       </w:r>
       <w:proofErr w:type="spellStart"/>
       <w:r>
         <w:t>json</w:t>
       </w:r>
       <w:proofErr w:type="spellEnd"/>
-      <w:proofErr w:type="gramEnd"/>
       <w:r>
         <w:t xml:space="preserve">. </w:t>
       </w:r>
@@ -3017,10 +2983,7 @@
       </w:pPr>
       <w:r>
         <w:lastRenderedPageBreak/>
-        <w:t xml:space="preserve">#4 — Labels </w:t>
-      </w:r>
-      <w:r>
-        <w:t>des graphiques</w:t>
+        <w:t>#4 — Labels des graphiques</w:t>
       </w:r>
     </w:p>
     <w:p>
@@ -3046,15 +3009,7 @@
     </w:p>
     <w:p>
       <w:r>
-        <w:t>•   Afficher ou masquer une série -</w:t>
-      </w:r>
-      <w:proofErr w:type="gramStart"/>
-      <w:r>
-        <w:t>&gt;  La</w:t>
-      </w:r>
-      <w:proofErr w:type="gramEnd"/>
-      <w:r>
-        <w:t xml:space="preserve"> légende actualise instantanément le nom et la pastille de couleur correspondante.</w:t>
+        <w:t>•   Afficher ou masquer une série -&gt;  La légende actualise instantanément le nom et la pastille de couleur correspondante.</w:t>
       </w:r>
     </w:p>
     <w:p/>
@@ -3706,6 +3661,28 @@
     </w:p>
     <w:p>
       <w:pPr>
+        <w:pStyle w:val="Retraitcorpsdetexte"/>
+      </w:pPr>
+      <w:r>
+        <w:t xml:space="preserve">Ma planification initialise était surestimé, j’ai laissé 2 </w:t>
+      </w:r>
+      <w:r>
+        <w:t>semaines</w:t>
+      </w:r>
+      <w:r>
+        <w:t xml:space="preserve"> pour l’intégration de </w:t>
+      </w:r>
+      <w:proofErr w:type="spellStart"/>
+      <w:r>
+        <w:t>Scottplot</w:t>
+      </w:r>
+      <w:proofErr w:type="spellEnd"/>
+      <w:r>
+        <w:t>, mais apparemment c’est beaucoup plus simple que je pensais, et a pris beaucoup moins de temps.</w:t>
+      </w:r>
+    </w:p>
+    <w:p>
+      <w:pPr>
         <w:pStyle w:val="Informations"/>
         <w:numPr>
           <w:ilvl w:val="5"/>
@@ -3759,13 +3736,8 @@
         </w:numPr>
       </w:pPr>
       <w:r>
-        <w:t xml:space="preserve">Si c’était à </w:t>
-      </w:r>
-      <w:proofErr w:type="gramStart"/>
-      <w:r>
-        <w:t>refaire:</w:t>
-      </w:r>
-      <w:proofErr w:type="gramEnd"/>
+        <w:t>Si c’était à refaire:</w:t>
+      </w:r>
     </w:p>
     <w:p>
       <w:pPr>
@@ -3811,13 +3783,8 @@
           <w:numId w:val="24"/>
         </w:numPr>
       </w:pPr>
-      <w:proofErr w:type="gramStart"/>
-      <w:r>
-        <w:t>Suite à</w:t>
-      </w:r>
-      <w:proofErr w:type="gramEnd"/>
-      <w:r>
-        <w:t xml:space="preserve"> donner, améliorations souhaitables, …</w:t>
+      <w:r>
+        <w:t>Suite à donner, améliorations souhaitables, …</w:t>
       </w:r>
     </w:p>
     <w:p>
@@ -3854,13 +3821,8 @@
         </w:numPr>
       </w:pPr>
       <w:r>
-        <w:t xml:space="preserve">Si c’était à </w:t>
-      </w:r>
-      <w:proofErr w:type="gramStart"/>
-      <w:r>
-        <w:t>refaire:</w:t>
-      </w:r>
-      <w:proofErr w:type="gramEnd"/>
+        <w:t>Si c’était à refaire:</w:t>
+      </w:r>
     </w:p>
     <w:p>
       <w:pPr>
@@ -3906,13 +3868,8 @@
           <w:numId w:val="24"/>
         </w:numPr>
       </w:pPr>
-      <w:proofErr w:type="gramStart"/>
-      <w:r>
-        <w:t>Suite à</w:t>
-      </w:r>
-      <w:proofErr w:type="gramEnd"/>
-      <w:r>
-        <w:t xml:space="preserve"> donner, améliorations souhaitables, …</w:t>
+      <w:r>
+        <w:t>Suite à donner, améliorations souhaitables, …</w:t>
       </w:r>
     </w:p>
     <w:p>
@@ -3950,16 +3907,11 @@
         </w:numPr>
       </w:pPr>
       <w:r>
-        <w:t xml:space="preserve">Si c’était à </w:t>
-      </w:r>
-      <w:proofErr w:type="gramStart"/>
-      <w:r>
-        <w:t>refaire</w:t>
+        <w:t>Si c’était à refaire</w:t>
       </w:r>
       <w:r>
         <w:t>:</w:t>
       </w:r>
-      <w:proofErr w:type="gramEnd"/>
     </w:p>
     <w:p>
       <w:pPr>
@@ -4026,13 +3978,9 @@
           <w:numId w:val="24"/>
         </w:numPr>
       </w:pPr>
-      <w:proofErr w:type="gramStart"/>
-      <w:r>
-        <w:t>Suite à</w:t>
-      </w:r>
-      <w:proofErr w:type="gramEnd"/>
-      <w:r>
-        <w:t xml:space="preserve"> donner, améliorations souhaitables, …</w:t>
+      <w:r>
+        <w:lastRenderedPageBreak/>
+        <w:t>Suite à donner, améliorations souhaitables, …</w:t>
       </w:r>
     </w:p>
     <w:p>
@@ -4055,7 +4003,6 @@
       <w:bookmarkStart w:id="32" w:name="_Toc165969657"/>
       <w:bookmarkStart w:id="33" w:name="_Toc71040041"/>
       <w:r>
-        <w:lastRenderedPageBreak/>
         <w:t>Divers</w:t>
       </w:r>
       <w:bookmarkEnd w:id="31"/>
@@ -4509,21 +4456,12 @@
               <w:szCs w:val="16"/>
             </w:rPr>
           </w:pPr>
-          <w:proofErr w:type="gramStart"/>
           <w:r>
             <w:rPr>
               <w:rFonts w:cs="Arial"/>
               <w:szCs w:val="16"/>
             </w:rPr>
-            <w:t>Version:</w:t>
-          </w:r>
-          <w:proofErr w:type="gramEnd"/>
-          <w:r>
-            <w:rPr>
-              <w:rFonts w:cs="Arial"/>
-              <w:szCs w:val="16"/>
-            </w:rPr>
-            <w:t xml:space="preserve"> </w:t>
+            <w:t xml:space="preserve">Version: </w:t>
           </w:r>
           <w:fldSimple w:instr=" REVNUM   \* MERGEFORMAT ">
             <w:r>
@@ -4569,7 +4507,7 @@
               <w:noProof/>
               <w:szCs w:val="16"/>
             </w:rPr>
-            <w:t>24.08.2026 11:19</w:t>
+            <w:t>31.08.2026 11:18</w:t>
           </w:r>
           <w:r>
             <w:rPr>
@@ -4781,7 +4719,7 @@
         <v:path o:extrusionok="f" gradientshapeok="t" o:connecttype="rect"/>
         <o:lock v:ext="edit" aspectratio="t"/>
       </v:shapetype>
-      <v:shape id="_x0000_i1025" type="#_x0000_t75" style="width:11.2pt;height:11.2pt" o:bullet="t">
+      <v:shape id="_x0000_i1025" type="#_x0000_t75" style="width:11.25pt;height:11.25pt" o:bullet="t">
         <v:imagedata r:id="rId1" o:title="BD10263_"/>
       </v:shape>
     </w:pict>
@@ -9407,6 +9345,7 @@
   <w:style w:type="character" w:default="1" w:styleId="Policepardfaut">
     <w:name w:val="Default Paragraph Font"/>
     <w:uiPriority w:val="1"/>
+    <w:semiHidden/>
     <w:unhideWhenUsed/>
   </w:style>
   <w:style w:type="table" w:default="1" w:styleId="TableauNormal">
@@ -10215,6 +10154,15 @@
 </file>
 
 <file path=customXml/item1.xml><?xml version="1.0" encoding="utf-8"?>
+<?mso-contentType ?>
+<FormTemplates xmlns="http://schemas.microsoft.com/sharepoint/v3/contenttype/forms">
+  <Display>DocumentLibraryForm</Display>
+  <Edit>DocumentLibraryForm</Edit>
+  <New>DocumentLibraryForm</New>
+</FormTemplates>
+</file>
+
+<file path=customXml/item2.xml><?xml version="1.0" encoding="utf-8"?>
 <p:properties xmlns:p="http://schemas.microsoft.com/office/2006/metadata/properties" xmlns:xsi="http://www.w3.org/2001/XMLSchema-instance" xmlns:pc="http://schemas.microsoft.com/office/infopath/2007/PartnerControls">
   <documentManagement>
     <lcf76f155ced4ddcb4097134ff3c332f xmlns="a1b10758-7132-46a4-a2fe-7a2cf46f51f4">
@@ -10225,16 +10173,11 @@
 </p:properties>
 </file>
 
-<file path=customXml/item2.xml><?xml version="1.0" encoding="utf-8"?>
-<?mso-contentType ?>
-<FormTemplates xmlns="http://schemas.microsoft.com/sharepoint/v3/contenttype/forms">
-  <Display>DocumentLibraryForm</Display>
-  <Edit>DocumentLibraryForm</Edit>
-  <New>DocumentLibraryForm</New>
-</FormTemplates>
+<file path=customXml/item3.xml><?xml version="1.0" encoding="utf-8"?>
+<b:Sources xmlns:b="http://schemas.openxmlformats.org/officeDocument/2006/bibliography" xmlns="http://schemas.openxmlformats.org/officeDocument/2006/bibliography" SelectedStyle="\APA.XSL" StyleName="APA"/>
 </file>
 
-<file path=customXml/item3.xml><?xml version="1.0" encoding="utf-8"?>
+<file path=customXml/item4.xml><?xml version="1.0" encoding="utf-8"?>
 <ct:contentTypeSchema xmlns:ct="http://schemas.microsoft.com/office/2006/metadata/contentType" xmlns:ma="http://schemas.microsoft.com/office/2006/metadata/properties/metaAttributes" ct:_="" ma:_="" ma:contentTypeName="Document" ma:contentTypeID="0x0101005A5B8F5EAAC22C48A11F5D9A60E6F21D" ma:contentTypeVersion="16" ma:contentTypeDescription="Crée un document." ma:contentTypeScope="" ma:versionID="f2b963976306cc54294b7f4545a3c6c4">
   <xsd:schema xmlns:xsd="http://www.w3.org/2001/XMLSchema" xmlns:xs="http://www.w3.org/2001/XMLSchema" xmlns:p="http://schemas.microsoft.com/office/2006/metadata/properties" xmlns:ns2="a1b10758-7132-46a4-a2fe-7a2cf46f51f4" xmlns:ns3="f7d9f5a6-831d-4621-8c77-cbcaf993e406" targetNamespace="http://schemas.microsoft.com/office/2006/metadata/properties" ma:root="true" ma:fieldsID="e5e135fa2fc1295e1586ddcd9c1a8904" ns2:_="" ns3:_="">
     <xsd:import namespace="a1b10758-7132-46a4-a2fe-7a2cf46f51f4"/>
@@ -10477,11 +10420,15 @@
 </ct:contentTypeSchema>
 </file>
 
-<file path=customXml/item4.xml><?xml version="1.0" encoding="utf-8"?>
-<b:Sources xmlns:b="http://schemas.openxmlformats.org/officeDocument/2006/bibliography" xmlns="http://schemas.openxmlformats.org/officeDocument/2006/bibliography" SelectedStyle="\APA.XSL" StyleName="APA"/>
+<file path=customXml/itemProps1.xml><?xml version="1.0" encoding="utf-8"?>
+<ds:datastoreItem xmlns:ds="http://schemas.openxmlformats.org/officeDocument/2006/customXml" ds:itemID="{5E865F57-6285-4B13-9F81-ABD3A2DB1ADD}">
+  <ds:schemaRefs>
+    <ds:schemaRef ds:uri="http://schemas.microsoft.com/sharepoint/v3/contenttype/forms"/>
+  </ds:schemaRefs>
+</ds:datastoreItem>
 </file>
 
-<file path=customXml/itemProps1.xml><?xml version="1.0" encoding="utf-8"?>
+<file path=customXml/itemProps2.xml><?xml version="1.0" encoding="utf-8"?>
 <ds:datastoreItem xmlns:ds="http://schemas.openxmlformats.org/officeDocument/2006/customXml" ds:itemID="{24954833-9F05-49C5-955F-86E47D037F04}">
   <ds:schemaRefs>
     <ds:schemaRef ds:uri="http://schemas.microsoft.com/office/2006/metadata/properties"/>
@@ -10492,15 +10439,15 @@
 </ds:datastoreItem>
 </file>
 
-<file path=customXml/itemProps2.xml><?xml version="1.0" encoding="utf-8"?>
-<ds:datastoreItem xmlns:ds="http://schemas.openxmlformats.org/officeDocument/2006/customXml" ds:itemID="{5E865F57-6285-4B13-9F81-ABD3A2DB1ADD}">
+<file path=customXml/itemProps3.xml><?xml version="1.0" encoding="utf-8"?>
+<ds:datastoreItem xmlns:ds="http://schemas.openxmlformats.org/officeDocument/2006/customXml" ds:itemID="{CC7784B4-F310-4DC4-8DFD-79BD564D2FFE}">
   <ds:schemaRefs>
-    <ds:schemaRef ds:uri="http://schemas.microsoft.com/sharepoint/v3/contenttype/forms"/>
+    <ds:schemaRef ds:uri="http://schemas.openxmlformats.org/officeDocument/2006/bibliography"/>
   </ds:schemaRefs>
 </ds:datastoreItem>
 </file>
 
-<file path=customXml/itemProps3.xml><?xml version="1.0" encoding="utf-8"?>
+<file path=customXml/itemProps4.xml><?xml version="1.0" encoding="utf-8"?>
 <ds:datastoreItem xmlns:ds="http://schemas.openxmlformats.org/officeDocument/2006/customXml" ds:itemID="{C9A788E4-007D-401C-881B-2F70B33A007D}">
   <ds:schemaRefs>
     <ds:schemaRef ds:uri="http://schemas.microsoft.com/office/2006/metadata/contentType"/>
@@ -10517,12 +10464,4 @@
     <ds:schemaRef ds:uri="http://schemas.microsoft.com/internal/obd"/>
   </ds:schemaRefs>
 </ds:datastoreItem>
-</file>
-
-<file path=customXml/itemProps4.xml><?xml version="1.0" encoding="utf-8"?>
-<ds:datastoreItem xmlns:ds="http://schemas.openxmlformats.org/officeDocument/2006/customXml" ds:itemID="{CC7784B4-F310-4DC4-8DFD-79BD564D2FFE}">
-  <ds:schemaRefs>
-    <ds:schemaRef ds:uri="http://schemas.openxmlformats.org/officeDocument/2006/bibliography"/>
-  </ds:schemaRefs>
-</ds:datastoreItem>
 </file>
</xml_diff>